<commit_message>
Unit 2 test study guide rebuilt to Matt's six-section spec, 2 pages plus key
Sublevels and filling rules; longhand with orbital diagrams (Ge, Si); shorthand with an
f-block atom (Pb) and the Cu exception, plus a Cr exception question; valence electrons;
cation and anion formation; ground/excited states, color and flame tests. No quiz element
reused. Key handwriting now sets ^x^ as superscript (ion symbols).

Co-Authored-By: Claude Opus 5.5 <noreply@anthropic.com>
Claude-Session: https://claude.ai/code/session_01LaT1EarAMnh5opQoFahNzN
</commit_message>
<xml_diff>
--- a/output/chem-u02/Unit 2 Study Guide.docx
+++ b/output/chem-u02/Unit 2 Study Guide.docx
@@ -47,7 +47,7 @@
                 <w:color w:val="14161B"/>
                 <w:sz w:val="26"/>
               </w:rPr>
-              <w:t>UNIT 2 STUDY GUIDE: ELECTRONS &amp; ATOMIC THEORY</w:t>
+              <w:t>UNIT 2 TEST STUDY GUIDE: ELECTRONS &amp; ATOMIC THEORY</w:t>
             </w:r>
           </w:p>
           <w:p>
@@ -62,7 +62,7 @@
                 <w:sz w:val="14"/>
                 <w:spacing w:val="26"/>
               </w:rPr>
-              <w:t>STUDY GUIDE  ·  UNIT 2  ·  S2.1 – S2.5</w:t>
+              <w:t>UNIT 2 TEST  ·  S2.2 – S2.5</w:t>
             </w:r>
           </w:p>
         </w:tc>
@@ -217,7 +217,7 @@
                 <w:b w:val="0"/>
                 <w:sz w:val="19"/>
               </w:rPr>
-              <w:t>Work each section, then check it against your notes. Anything you miss tells you what to practise before the test.</w:t>
+              <w:t>Use a periodic table. Work each section, then check it against your notes. Anything you miss tells you what to practise before the test.</w:t>
             </w:r>
           </w:p>
         </w:tc>
@@ -267,8 +267,458 @@
                 <w:sz w:val="17"/>
                 <w:spacing w:val="26"/>
               </w:rPr>
-              <w:t>S2.1  ·  THE BOHR MODEL</w:t>
+              <w:t>1  ·  SUBLEVELS, ENERGY LEVELS &amp; FILLING RULES</w:t>
             </w:r>
+          </w:p>
+        </w:tc>
+      </w:tr>
+    </w:tbl>
+    <w:p>
+      <w:pPr>
+        <w:spacing w:before="0" w:after="0" w:line="40" w:lineRule="exact"/>
+      </w:pPr>
+      <w:r>
+        <w:rPr>
+          <w:rFonts w:ascii="Trade Gothic Next" w:hAnsi="Trade Gothic Next"/>
+          <w:sz w:val="2"/>
+        </w:rPr>
+      </w:r>
+    </w:p>
+    <w:tbl>
+      <w:tblPr>
+        <w:tblW w:type="auto" w:w="0"/>
+        <w:tblLayout w:type="fixed"/>
+        <w:tblLook w:firstColumn="1" w:firstRow="1" w:lastColumn="0" w:lastRow="0" w:noHBand="0" w:noVBand="1" w:val="04A0"/>
+        <w:tblLayout w:type="fixed"/>
+      </w:tblPr>
+      <w:tblGrid>
+        <w:gridCol w:w="2736"/>
+        <w:gridCol w:w="2016"/>
+        <w:gridCol w:w="2016"/>
+        <w:gridCol w:w="2016"/>
+        <w:gridCol w:w="2016"/>
+      </w:tblGrid>
+      <w:tr>
+        <w:tc>
+          <w:tcPr>
+            <w:tcW w:type="dxa" w:w="2736"/>
+            <w:tcBorders>
+              <w:bottom w:val="single" w:sz="12" w:color="A3E635"/>
+            </w:tcBorders>
+            <w:vAlign w:val="center"/>
+            <w:tcMar>
+              <w:top w:w="20" w:type="dxa"/>
+              <w:left w:w="60" w:type="dxa"/>
+              <w:bottom w:w="20" w:type="dxa"/>
+              <w:right w:w="40" w:type="dxa"/>
+            </w:tcMar>
+          </w:tcPr>
+          <w:p>
+            <w:pPr>
+              <w:keepNext/>
+              <w:spacing w:after="0"/>
+            </w:pPr>
+            <w:r>
+              <w:rPr>
+                <w:rFonts w:ascii="Trade Gothic Next" w:hAnsi="Trade Gothic Next"/>
+                <w:b/>
+                <w:color w:val="4D730E"/>
+                <w:sz w:val="16"/>
+                <w:u w:val="none"/>
+              </w:rPr>
+              <w:t>SUBLEVEL</w:t>
+            </w:r>
+          </w:p>
+        </w:tc>
+        <w:tc>
+          <w:tcPr>
+            <w:tcW w:type="dxa" w:w="2016"/>
+            <w:tcBorders>
+              <w:bottom w:val="single" w:sz="12" w:color="A3E635"/>
+            </w:tcBorders>
+            <w:vAlign w:val="center"/>
+            <w:tcMar>
+              <w:top w:w="20" w:type="dxa"/>
+              <w:left w:w="60" w:type="dxa"/>
+              <w:bottom w:w="20" w:type="dxa"/>
+              <w:right w:w="40" w:type="dxa"/>
+            </w:tcMar>
+          </w:tcPr>
+          <w:p>
+            <w:pPr>
+              <w:keepNext/>
+              <w:spacing w:after="0"/>
+            </w:pPr>
+            <w:r>
+              <w:rPr>
+                <w:rFonts w:ascii="Trade Gothic Next" w:hAnsi="Trade Gothic Next"/>
+                <w:b/>
+                <w:color w:val="4D730E"/>
+                <w:sz w:val="16"/>
+                <w:u w:val="none"/>
+              </w:rPr>
+              <w:t>s</w:t>
+            </w:r>
+          </w:p>
+        </w:tc>
+        <w:tc>
+          <w:tcPr>
+            <w:tcW w:type="dxa" w:w="2016"/>
+            <w:tcBorders>
+              <w:bottom w:val="single" w:sz="12" w:color="A3E635"/>
+            </w:tcBorders>
+            <w:vAlign w:val="center"/>
+            <w:tcMar>
+              <w:top w:w="20" w:type="dxa"/>
+              <w:left w:w="60" w:type="dxa"/>
+              <w:bottom w:w="20" w:type="dxa"/>
+              <w:right w:w="40" w:type="dxa"/>
+            </w:tcMar>
+          </w:tcPr>
+          <w:p>
+            <w:pPr>
+              <w:keepNext/>
+              <w:spacing w:after="0"/>
+            </w:pPr>
+            <w:r>
+              <w:rPr>
+                <w:rFonts w:ascii="Trade Gothic Next" w:hAnsi="Trade Gothic Next"/>
+                <w:b/>
+                <w:color w:val="4D730E"/>
+                <w:sz w:val="16"/>
+                <w:u w:val="none"/>
+              </w:rPr>
+              <w:t>p</w:t>
+            </w:r>
+          </w:p>
+        </w:tc>
+        <w:tc>
+          <w:tcPr>
+            <w:tcW w:type="dxa" w:w="2016"/>
+            <w:tcBorders>
+              <w:bottom w:val="single" w:sz="12" w:color="A3E635"/>
+            </w:tcBorders>
+            <w:vAlign w:val="center"/>
+            <w:tcMar>
+              <w:top w:w="20" w:type="dxa"/>
+              <w:left w:w="60" w:type="dxa"/>
+              <w:bottom w:w="20" w:type="dxa"/>
+              <w:right w:w="40" w:type="dxa"/>
+            </w:tcMar>
+          </w:tcPr>
+          <w:p>
+            <w:pPr>
+              <w:keepNext/>
+              <w:spacing w:after="0"/>
+            </w:pPr>
+            <w:r>
+              <w:rPr>
+                <w:rFonts w:ascii="Trade Gothic Next" w:hAnsi="Trade Gothic Next"/>
+                <w:b/>
+                <w:color w:val="4D730E"/>
+                <w:sz w:val="16"/>
+                <w:u w:val="none"/>
+              </w:rPr>
+              <w:t>d</w:t>
+            </w:r>
+          </w:p>
+        </w:tc>
+        <w:tc>
+          <w:tcPr>
+            <w:tcW w:type="dxa" w:w="2016"/>
+            <w:tcBorders>
+              <w:bottom w:val="single" w:sz="12" w:color="A3E635"/>
+            </w:tcBorders>
+            <w:vAlign w:val="center"/>
+            <w:tcMar>
+              <w:top w:w="20" w:type="dxa"/>
+              <w:left w:w="60" w:type="dxa"/>
+              <w:bottom w:w="20" w:type="dxa"/>
+              <w:right w:w="40" w:type="dxa"/>
+            </w:tcMar>
+          </w:tcPr>
+          <w:p>
+            <w:pPr>
+              <w:keepNext/>
+              <w:spacing w:after="0"/>
+            </w:pPr>
+            <w:r>
+              <w:rPr>
+                <w:rFonts w:ascii="Trade Gothic Next" w:hAnsi="Trade Gothic Next"/>
+                <w:b/>
+                <w:color w:val="4D730E"/>
+                <w:sz w:val="16"/>
+                <w:u w:val="none"/>
+              </w:rPr>
+              <w:t>f</w:t>
+            </w:r>
+          </w:p>
+        </w:tc>
+      </w:tr>
+      <w:tr>
+        <w:trPr>
+          <w:cantSplit/>
+          <w:trHeight w:val="432" w:hRule="atLeast"/>
+        </w:trPr>
+        <w:tc>
+          <w:tcPr>
+            <w:tcW w:type="dxa" w:w="2736"/>
+            <w:tcBorders>
+              <w:top w:val="single" w:sz="4" w:color="C8CDC2"/>
+              <w:left w:val="single" w:sz="4" w:color="C8CDC2"/>
+              <w:bottom w:val="single" w:sz="4" w:color="C8CDC2"/>
+              <w:right w:val="single" w:sz="4" w:color="C8CDC2"/>
+            </w:tcBorders>
+            <w:vAlign w:val="center"/>
+            <w:tcMar>
+              <w:top w:w="10" w:type="dxa"/>
+              <w:left w:w="60" w:type="dxa"/>
+              <w:bottom w:w="10" w:type="dxa"/>
+              <w:right w:w="40" w:type="dxa"/>
+            </w:tcMar>
+          </w:tcPr>
+          <w:p>
+            <w:pPr>
+              <w:keepNext/>
+              <w:spacing w:after="0"/>
+            </w:pPr>
+            <w:r>
+              <w:rPr>
+                <w:rFonts w:ascii="Trade Gothic Next" w:hAnsi="Trade Gothic Next"/>
+                <w:b/>
+                <w:color w:val="14161B"/>
+                <w:sz w:val="20"/>
+                <w:u w:val="none"/>
+              </w:rPr>
+              <w:t>Orbitals</w:t>
+            </w:r>
+          </w:p>
+        </w:tc>
+        <w:tc>
+          <w:tcPr>
+            <w:tcW w:type="dxa" w:w="2016"/>
+            <w:tcBorders>
+              <w:top w:val="single" w:sz="4" w:color="C8CDC2"/>
+              <w:left w:val="single" w:sz="4" w:color="C8CDC2"/>
+              <w:bottom w:val="single" w:sz="4" w:color="C8CDC2"/>
+              <w:right w:val="single" w:sz="4" w:color="C8CDC2"/>
+            </w:tcBorders>
+            <w:vAlign w:val="center"/>
+            <w:tcMar>
+              <w:top w:w="10" w:type="dxa"/>
+              <w:left w:w="60" w:type="dxa"/>
+              <w:bottom w:w="10" w:type="dxa"/>
+              <w:right w:w="40" w:type="dxa"/>
+            </w:tcMar>
+          </w:tcPr>
+          <w:p>
+            <w:pPr>
+              <w:keepNext/>
+              <w:spacing w:after="0"/>
+            </w:pPr>
+          </w:p>
+        </w:tc>
+        <w:tc>
+          <w:tcPr>
+            <w:tcW w:type="dxa" w:w="2016"/>
+            <w:tcBorders>
+              <w:top w:val="single" w:sz="4" w:color="C8CDC2"/>
+              <w:left w:val="single" w:sz="4" w:color="C8CDC2"/>
+              <w:bottom w:val="single" w:sz="4" w:color="C8CDC2"/>
+              <w:right w:val="single" w:sz="4" w:color="C8CDC2"/>
+            </w:tcBorders>
+            <w:vAlign w:val="center"/>
+            <w:tcMar>
+              <w:top w:w="10" w:type="dxa"/>
+              <w:left w:w="60" w:type="dxa"/>
+              <w:bottom w:w="10" w:type="dxa"/>
+              <w:right w:w="40" w:type="dxa"/>
+            </w:tcMar>
+          </w:tcPr>
+          <w:p>
+            <w:pPr>
+              <w:keepNext/>
+              <w:spacing w:after="0"/>
+            </w:pPr>
+          </w:p>
+        </w:tc>
+        <w:tc>
+          <w:tcPr>
+            <w:tcW w:type="dxa" w:w="2016"/>
+            <w:tcBorders>
+              <w:top w:val="single" w:sz="4" w:color="C8CDC2"/>
+              <w:left w:val="single" w:sz="4" w:color="C8CDC2"/>
+              <w:bottom w:val="single" w:sz="4" w:color="C8CDC2"/>
+              <w:right w:val="single" w:sz="4" w:color="C8CDC2"/>
+            </w:tcBorders>
+            <w:vAlign w:val="center"/>
+            <w:tcMar>
+              <w:top w:w="10" w:type="dxa"/>
+              <w:left w:w="60" w:type="dxa"/>
+              <w:bottom w:w="10" w:type="dxa"/>
+              <w:right w:w="40" w:type="dxa"/>
+            </w:tcMar>
+          </w:tcPr>
+          <w:p>
+            <w:pPr>
+              <w:keepNext/>
+              <w:spacing w:after="0"/>
+            </w:pPr>
+          </w:p>
+        </w:tc>
+        <w:tc>
+          <w:tcPr>
+            <w:tcW w:type="dxa" w:w="2016"/>
+            <w:tcBorders>
+              <w:top w:val="single" w:sz="4" w:color="C8CDC2"/>
+              <w:left w:val="single" w:sz="4" w:color="C8CDC2"/>
+              <w:bottom w:val="single" w:sz="4" w:color="C8CDC2"/>
+              <w:right w:val="single" w:sz="4" w:color="C8CDC2"/>
+            </w:tcBorders>
+            <w:vAlign w:val="center"/>
+            <w:tcMar>
+              <w:top w:w="10" w:type="dxa"/>
+              <w:left w:w="60" w:type="dxa"/>
+              <w:bottom w:w="10" w:type="dxa"/>
+              <w:right w:w="40" w:type="dxa"/>
+            </w:tcMar>
+          </w:tcPr>
+          <w:p>
+            <w:pPr>
+              <w:keepNext/>
+              <w:spacing w:after="0"/>
+            </w:pPr>
+          </w:p>
+        </w:tc>
+      </w:tr>
+      <w:tr>
+        <w:trPr>
+          <w:cantSplit/>
+          <w:trHeight w:val="432" w:hRule="atLeast"/>
+        </w:trPr>
+        <w:tc>
+          <w:tcPr>
+            <w:tcW w:type="dxa" w:w="2736"/>
+            <w:tcBorders>
+              <w:top w:val="single" w:sz="4" w:color="C8CDC2"/>
+              <w:left w:val="single" w:sz="4" w:color="C8CDC2"/>
+              <w:bottom w:val="single" w:sz="4" w:color="C8CDC2"/>
+              <w:right w:val="single" w:sz="4" w:color="C8CDC2"/>
+            </w:tcBorders>
+            <w:vAlign w:val="center"/>
+            <w:tcMar>
+              <w:top w:w="10" w:type="dxa"/>
+              <w:left w:w="60" w:type="dxa"/>
+              <w:bottom w:w="10" w:type="dxa"/>
+              <w:right w:w="40" w:type="dxa"/>
+            </w:tcMar>
+          </w:tcPr>
+          <w:p>
+            <w:pPr>
+              <w:spacing w:after="0"/>
+            </w:pPr>
+            <w:r>
+              <w:rPr>
+                <w:rFonts w:ascii="Trade Gothic Next" w:hAnsi="Trade Gothic Next"/>
+                <w:b/>
+                <w:color w:val="14161B"/>
+                <w:sz w:val="20"/>
+                <w:u w:val="none"/>
+              </w:rPr>
+              <w:t>Max electrons</w:t>
+            </w:r>
+          </w:p>
+        </w:tc>
+        <w:tc>
+          <w:tcPr>
+            <w:tcW w:type="dxa" w:w="2016"/>
+            <w:tcBorders>
+              <w:top w:val="single" w:sz="4" w:color="C8CDC2"/>
+              <w:left w:val="single" w:sz="4" w:color="C8CDC2"/>
+              <w:bottom w:val="single" w:sz="4" w:color="C8CDC2"/>
+              <w:right w:val="single" w:sz="4" w:color="C8CDC2"/>
+            </w:tcBorders>
+            <w:vAlign w:val="center"/>
+            <w:tcMar>
+              <w:top w:w="10" w:type="dxa"/>
+              <w:left w:w="60" w:type="dxa"/>
+              <w:bottom w:w="10" w:type="dxa"/>
+              <w:right w:w="40" w:type="dxa"/>
+            </w:tcMar>
+          </w:tcPr>
+          <w:p>
+            <w:pPr>
+              <w:spacing w:after="0"/>
+            </w:pPr>
+          </w:p>
+        </w:tc>
+        <w:tc>
+          <w:tcPr>
+            <w:tcW w:type="dxa" w:w="2016"/>
+            <w:tcBorders>
+              <w:top w:val="single" w:sz="4" w:color="C8CDC2"/>
+              <w:left w:val="single" w:sz="4" w:color="C8CDC2"/>
+              <w:bottom w:val="single" w:sz="4" w:color="C8CDC2"/>
+              <w:right w:val="single" w:sz="4" w:color="C8CDC2"/>
+            </w:tcBorders>
+            <w:vAlign w:val="center"/>
+            <w:tcMar>
+              <w:top w:w="10" w:type="dxa"/>
+              <w:left w:w="60" w:type="dxa"/>
+              <w:bottom w:w="10" w:type="dxa"/>
+              <w:right w:w="40" w:type="dxa"/>
+            </w:tcMar>
+          </w:tcPr>
+          <w:p>
+            <w:pPr>
+              <w:spacing w:after="0"/>
+            </w:pPr>
+          </w:p>
+        </w:tc>
+        <w:tc>
+          <w:tcPr>
+            <w:tcW w:type="dxa" w:w="2016"/>
+            <w:tcBorders>
+              <w:top w:val="single" w:sz="4" w:color="C8CDC2"/>
+              <w:left w:val="single" w:sz="4" w:color="C8CDC2"/>
+              <w:bottom w:val="single" w:sz="4" w:color="C8CDC2"/>
+              <w:right w:val="single" w:sz="4" w:color="C8CDC2"/>
+            </w:tcBorders>
+            <w:vAlign w:val="center"/>
+            <w:tcMar>
+              <w:top w:w="10" w:type="dxa"/>
+              <w:left w:w="60" w:type="dxa"/>
+              <w:bottom w:w="10" w:type="dxa"/>
+              <w:right w:w="40" w:type="dxa"/>
+            </w:tcMar>
+          </w:tcPr>
+          <w:p>
+            <w:pPr>
+              <w:spacing w:after="0"/>
+            </w:pPr>
+          </w:p>
+        </w:tc>
+        <w:tc>
+          <w:tcPr>
+            <w:tcW w:type="dxa" w:w="2016"/>
+            <w:tcBorders>
+              <w:top w:val="single" w:sz="4" w:color="C8CDC2"/>
+              <w:left w:val="single" w:sz="4" w:color="C8CDC2"/>
+              <w:bottom w:val="single" w:sz="4" w:color="C8CDC2"/>
+              <w:right w:val="single" w:sz="4" w:color="C8CDC2"/>
+            </w:tcBorders>
+            <w:vAlign w:val="center"/>
+            <w:tcMar>
+              <w:top w:w="10" w:type="dxa"/>
+              <w:left w:w="60" w:type="dxa"/>
+              <w:bottom w:w="10" w:type="dxa"/>
+              <w:right w:w="40" w:type="dxa"/>
+            </w:tcMar>
+          </w:tcPr>
+          <w:p>
+            <w:pPr>
+              <w:spacing w:after="0"/>
+            </w:pPr>
           </w:p>
         </w:tc>
       </w:tr>
@@ -288,19 +738,16 @@
         <w:tc>
           <w:tcPr>
             <w:tcW w:type="dxa" w:w="10800"/>
-            <w:tcBorders>
-              <w:bottom w:val="single" w:sz="4" w:color="C8CDC2"/>
-            </w:tcBorders>
             <w:tcMar>
-              <w:top w:w="30" w:type="dxa"/>
+              <w:top w:w="60" w:type="dxa"/>
               <w:left w:w="40" w:type="dxa"/>
-              <w:bottom w:w="30" w:type="dxa"/>
+              <w:bottom w:w="20" w:type="dxa"/>
               <w:right w:w="40" w:type="dxa"/>
             </w:tcMar>
           </w:tcPr>
           <w:p>
             <w:pPr>
-              <w:spacing w:after="20"/>
+              <w:spacing w:after="40"/>
               <w:ind w:left="360" w:hanging="360"/>
             </w:pPr>
             <w:r>
@@ -321,82 +768,67 @@
                 <w:sz w:val="20"/>
                 <w:u w:val="none"/>
               </w:rPr>
-              <w:t>What does quantized mean for an electron's energy?</w:t>
+              <w:t>The sublevels in n = 3 are</w:t>
+            </w:r>
+            <w:r>
+              <w:rPr>
+                <w:rFonts w:ascii="Trade Gothic Next" w:hAnsi="Trade Gothic Next"/>
+                <w:b w:val="0"/>
+                <w:sz w:val="20"/>
+                <w:u w:val="none"/>
+              </w:rPr>
+              <w:t xml:space="preserve"> ______________ </w:t>
+            </w:r>
+            <w:r>
+              <w:rPr>
+                <w:rFonts w:ascii="Trade Gothic Next" w:hAnsi="Trade Gothic Next"/>
+                <w:b w:val="0"/>
+                <w:sz w:val="20"/>
+                <w:u w:val="none"/>
+              </w:rPr>
+              <w:t>.   Level n = 3 holds at most</w:t>
+            </w:r>
+            <w:r>
+              <w:rPr>
+                <w:rFonts w:ascii="Trade Gothic Next" w:hAnsi="Trade Gothic Next"/>
+                <w:b w:val="0"/>
+                <w:sz w:val="20"/>
+                <w:u w:val="none"/>
+              </w:rPr>
+              <w:t xml:space="preserve"> ______ </w:t>
+            </w:r>
+            <w:r>
+              <w:rPr>
+                <w:rFonts w:ascii="Trade Gothic Next" w:hAnsi="Trade Gothic Next"/>
+                <w:b w:val="0"/>
+                <w:sz w:val="20"/>
+                <w:u w:val="none"/>
+              </w:rPr>
+              <w:t>electrons (2n</w:t>
+            </w:r>
+            <w:r>
+              <w:rPr>
+                <w:rFonts w:ascii="Trade Gothic Next" w:hAnsi="Trade Gothic Next"/>
+                <w:b w:val="0"/>
+                <w:sz w:val="20"/>
+                <w:u w:val="none"/>
+                <w:vertAlign w:val="superscript"/>
+              </w:rPr>
+              <w:t>2</w:t>
+            </w:r>
+            <w:r>
+              <w:rPr>
+                <w:rFonts w:ascii="Trade Gothic Next" w:hAnsi="Trade Gothic Next"/>
+                <w:b w:val="0"/>
+                <w:sz w:val="20"/>
+                <w:u w:val="none"/>
+              </w:rPr>
+              <w:t>).</w:t>
             </w:r>
           </w:p>
-          <w:tbl>
-            <w:tblPr>
-              <w:tblW w:type="auto" w:w="0"/>
-              <w:tblLayout w:type="fixed"/>
-              <w:tblLook w:firstColumn="1" w:firstRow="1" w:lastColumn="0" w:lastRow="0" w:noHBand="0" w:noVBand="1" w:val="04A0"/>
-              <w:tblLayout w:type="fixed"/>
-            </w:tblPr>
-            <w:tblGrid>
-              <w:gridCol w:w="10152"/>
-            </w:tblGrid>
-            <w:tr>
-              <w:trPr>
-                <w:cantSplit/>
-                <w:trHeight w:val="460" w:hRule="atLeast"/>
-              </w:trPr>
-              <w:tc>
-                <w:tcPr>
-                  <w:tcW w:type="dxa" w:w="10152"/>
-                  <w:vAlign w:val="bottom"/>
-                  <w:tcBorders>
-                    <w:bottom w:val="single" w:sz="6" w:color="C8CDC2"/>
-                  </w:tcBorders>
-                  <w:tcMar>
-                    <w:top w:w="0" w:type="dxa"/>
-                    <w:left w:w="60" w:type="dxa"/>
-                    <w:bottom w:w="10" w:type="dxa"/>
-                    <w:right w:w="0" w:type="dxa"/>
-                  </w:tcMar>
-                </w:tcPr>
-                <w:p>
-                  <w:pPr>
-                    <w:spacing w:after="0"/>
-                  </w:pPr>
-                </w:p>
-              </w:tc>
-            </w:tr>
-          </w:tbl>
           <w:p>
             <w:pPr>
-              <w:spacing w:before="0" w:after="0" w:line="20" w:lineRule="exact"/>
-            </w:pPr>
-          </w:p>
-        </w:tc>
-      </w:tr>
-    </w:tbl>
-    <w:tbl>
-      <w:tblPr>
-        <w:tblW w:type="auto" w:w="0"/>
-        <w:jc w:val="left"/>
-        <w:tblLayout w:type="fixed"/>
-        <w:tblLook w:firstColumn="1" w:firstRow="1" w:lastColumn="0" w:lastRow="0" w:noHBand="0" w:noVBand="1" w:val="04A0"/>
-        <w:tblLayout w:type="fixed"/>
-      </w:tblPr>
-      <w:tblGrid>
-        <w:gridCol w:w="10800"/>
-      </w:tblGrid>
-      <w:tr>
-        <w:tc>
-          <w:tcPr>
-            <w:tcW w:type="dxa" w:w="10800"/>
-            <w:tcBorders>
-              <w:bottom w:val="single" w:sz="4" w:color="C8CDC2"/>
-            </w:tcBorders>
-            <w:tcMar>
-              <w:top w:w="30" w:type="dxa"/>
-              <w:left w:w="40" w:type="dxa"/>
-              <w:bottom w:w="30" w:type="dxa"/>
-              <w:right w:w="40" w:type="dxa"/>
-            </w:tcMar>
-          </w:tcPr>
-          <w:p>
-            <w:pPr>
-              <w:spacing w:after="20"/>
+              <w:spacing w:after="40"/>
               <w:ind w:left="360" w:hanging="360"/>
             </w:pPr>
             <w:r>
@@ -417,49 +849,326 @@
                 <w:sz w:val="20"/>
                 <w:u w:val="none"/>
               </w:rPr>
-              <w:t>Hydrogen's electron is in n = 1. Name that state, and name the state when it is in n = 3.</w:t>
+              <w:t>Which sublevel fills right after 4s?</w:t>
+            </w:r>
+            <w:r>
+              <w:rPr>
+                <w:rFonts w:ascii="Trade Gothic Next" w:hAnsi="Trade Gothic Next"/>
+                <w:b w:val="0"/>
+                <w:sz w:val="20"/>
+                <w:u w:val="none"/>
+              </w:rPr>
+              <w:t xml:space="preserve"> ________ </w:t>
+            </w:r>
+            <w:r>
+              <w:rPr>
+                <w:rFonts w:ascii="Trade Gothic Next" w:hAnsi="Trade Gothic Next"/>
+                <w:b w:val="0"/>
+                <w:sz w:val="20"/>
+                <w:u w:val="none"/>
+              </w:rPr>
+              <w:t xml:space="preserve">   Which fills right after 5p?</w:t>
+            </w:r>
+            <w:r>
+              <w:rPr>
+                <w:rFonts w:ascii="Trade Gothic Next" w:hAnsi="Trade Gothic Next"/>
+                <w:b w:val="0"/>
+                <w:sz w:val="20"/>
+                <w:u w:val="none"/>
+              </w:rPr>
+              <w:t xml:space="preserve"> ________ </w:t>
             </w:r>
           </w:p>
-          <w:tbl>
-            <w:tblPr>
-              <w:tblW w:type="auto" w:w="0"/>
-              <w:tblLayout w:type="fixed"/>
-              <w:tblLook w:firstColumn="1" w:firstRow="1" w:lastColumn="0" w:lastRow="0" w:noHBand="0" w:noVBand="1" w:val="04A0"/>
-              <w:tblLayout w:type="fixed"/>
-            </w:tblPr>
-            <w:tblGrid>
-              <w:gridCol w:w="10152"/>
-            </w:tblGrid>
-            <w:tr>
-              <w:trPr>
-                <w:cantSplit/>
-                <w:trHeight w:val="460" w:hRule="atLeast"/>
-              </w:trPr>
-              <w:tc>
-                <w:tcPr>
-                  <w:tcW w:type="dxa" w:w="10152"/>
-                  <w:vAlign w:val="bottom"/>
-                  <w:tcBorders>
-                    <w:bottom w:val="single" w:sz="6" w:color="C8CDC2"/>
-                  </w:tcBorders>
-                  <w:tcMar>
-                    <w:top w:w="0" w:type="dxa"/>
-                    <w:left w:w="60" w:type="dxa"/>
-                    <w:bottom w:w="10" w:type="dxa"/>
-                    <w:right w:w="0" w:type="dxa"/>
-                  </w:tcMar>
-                </w:tcPr>
-                <w:p>
-                  <w:pPr>
-                    <w:spacing w:after="0"/>
-                  </w:pPr>
-                </w:p>
-              </w:tc>
-            </w:tr>
-          </w:tbl>
           <w:p>
             <w:pPr>
-              <w:spacing w:before="0" w:after="0" w:line="20" w:lineRule="exact"/>
+              <w:spacing w:after="0"/>
+              <w:ind w:left="360" w:hanging="360"/>
+            </w:pPr>
+            <w:r>
+              <w:rPr>
+                <w:rFonts w:ascii="Trade Gothic Next" w:hAnsi="Trade Gothic Next"/>
+                <w:b/>
+                <w:color w:val="4D730E"/>
+                <w:sz w:val="20"/>
+                <w:u w:val="none"/>
+              </w:rPr>
+              <w:t xml:space="preserve">3   </w:t>
+            </w:r>
+            <w:r>
+              <w:rPr>
+                <w:rFonts w:ascii="Trade Gothic Next" w:hAnsi="Trade Gothic Next"/>
+                <w:b w:val="0"/>
+                <w:color w:val="14161B"/>
+                <w:sz w:val="20"/>
+                <w:u w:val="none"/>
+              </w:rPr>
+              <w:t>Name the rule each statement describes: Aufbau, Pauli exclusion or Hund.</w:t>
+            </w:r>
+          </w:p>
+        </w:tc>
+      </w:tr>
+    </w:tbl>
+    <w:tbl>
+      <w:tblPr>
+        <w:tblW w:type="auto" w:w="0"/>
+        <w:tblLayout w:type="fixed"/>
+        <w:tblLook w:firstColumn="1" w:firstRow="1" w:lastColumn="0" w:lastRow="0" w:noHBand="0" w:noVBand="1" w:val="04A0"/>
+        <w:tblLayout w:type="fixed"/>
+      </w:tblPr>
+      <w:tblGrid>
+        <w:gridCol w:w="7776"/>
+        <w:gridCol w:w="3024"/>
+      </w:tblGrid>
+      <w:tr>
+        <w:tc>
+          <w:tcPr>
+            <w:tcW w:type="dxa" w:w="7776"/>
+            <w:tcBorders>
+              <w:bottom w:val="single" w:sz="12" w:color="A3E635"/>
+            </w:tcBorders>
+            <w:vAlign w:val="center"/>
+            <w:tcMar>
+              <w:top w:w="20" w:type="dxa"/>
+              <w:left w:w="60" w:type="dxa"/>
+              <w:bottom w:w="20" w:type="dxa"/>
+              <w:right w:w="40" w:type="dxa"/>
+            </w:tcMar>
+          </w:tcPr>
+          <w:p>
+            <w:pPr>
+              <w:keepNext/>
+              <w:spacing w:after="0"/>
+            </w:pPr>
+            <w:r>
+              <w:rPr>
+                <w:rFonts w:ascii="Trade Gothic Next" w:hAnsi="Trade Gothic Next"/>
+                <w:b/>
+                <w:color w:val="4D730E"/>
+                <w:sz w:val="16"/>
+                <w:u w:val="none"/>
+              </w:rPr>
+              <w:t>STATEMENT</w:t>
+            </w:r>
+          </w:p>
+        </w:tc>
+        <w:tc>
+          <w:tcPr>
+            <w:tcW w:type="dxa" w:w="3024"/>
+            <w:tcBorders>
+              <w:bottom w:val="single" w:sz="12" w:color="A3E635"/>
+            </w:tcBorders>
+            <w:vAlign w:val="center"/>
+            <w:tcMar>
+              <w:top w:w="20" w:type="dxa"/>
+              <w:left w:w="60" w:type="dxa"/>
+              <w:bottom w:w="20" w:type="dxa"/>
+              <w:right w:w="40" w:type="dxa"/>
+            </w:tcMar>
+          </w:tcPr>
+          <w:p>
+            <w:pPr>
+              <w:keepNext/>
+              <w:spacing w:after="0"/>
+            </w:pPr>
+            <w:r>
+              <w:rPr>
+                <w:rFonts w:ascii="Trade Gothic Next" w:hAnsi="Trade Gothic Next"/>
+                <w:b/>
+                <w:color w:val="4D730E"/>
+                <w:sz w:val="16"/>
+                <w:u w:val="none"/>
+              </w:rPr>
+              <w:t>RULE</w:t>
+            </w:r>
+          </w:p>
+        </w:tc>
+      </w:tr>
+      <w:tr>
+        <w:trPr>
+          <w:cantSplit/>
+          <w:trHeight w:val="432" w:hRule="atLeast"/>
+        </w:trPr>
+        <w:tc>
+          <w:tcPr>
+            <w:tcW w:type="dxa" w:w="7776"/>
+            <w:tcBorders>
+              <w:top w:val="single" w:sz="4" w:color="C8CDC2"/>
+              <w:left w:val="single" w:sz="4" w:color="C8CDC2"/>
+              <w:bottom w:val="single" w:sz="4" w:color="C8CDC2"/>
+              <w:right w:val="single" w:sz="4" w:color="C8CDC2"/>
+            </w:tcBorders>
+            <w:vAlign w:val="center"/>
+            <w:tcMar>
+              <w:top w:w="10" w:type="dxa"/>
+              <w:left w:w="60" w:type="dxa"/>
+              <w:bottom w:w="10" w:type="dxa"/>
+              <w:right w:w="40" w:type="dxa"/>
+            </w:tcMar>
+          </w:tcPr>
+          <w:p>
+            <w:pPr>
+              <w:keepNext/>
+              <w:spacing w:after="0"/>
+            </w:pPr>
+            <w:r>
+              <w:rPr>
+                <w:rFonts w:ascii="Trade Gothic Next" w:hAnsi="Trade Gothic Next"/>
+                <w:b/>
+                <w:color w:val="14161B"/>
+                <w:sz w:val="20"/>
+                <w:u w:val="none"/>
+              </w:rPr>
+              <w:t>Electrons fill the lowest-energy sublevel first.</w:t>
+            </w:r>
+          </w:p>
+        </w:tc>
+        <w:tc>
+          <w:tcPr>
+            <w:tcW w:type="dxa" w:w="3024"/>
+            <w:tcBorders>
+              <w:top w:val="single" w:sz="4" w:color="C8CDC2"/>
+              <w:left w:val="single" w:sz="4" w:color="C8CDC2"/>
+              <w:bottom w:val="single" w:sz="4" w:color="C8CDC2"/>
+              <w:right w:val="single" w:sz="4" w:color="C8CDC2"/>
+            </w:tcBorders>
+            <w:vAlign w:val="center"/>
+            <w:tcMar>
+              <w:top w:w="10" w:type="dxa"/>
+              <w:left w:w="60" w:type="dxa"/>
+              <w:bottom w:w="10" w:type="dxa"/>
+              <w:right w:w="40" w:type="dxa"/>
+            </w:tcMar>
+          </w:tcPr>
+          <w:p>
+            <w:pPr>
+              <w:keepNext/>
+              <w:spacing w:after="0"/>
+            </w:pPr>
+          </w:p>
+        </w:tc>
+      </w:tr>
+      <w:tr>
+        <w:trPr>
+          <w:cantSplit/>
+          <w:trHeight w:val="432" w:hRule="atLeast"/>
+        </w:trPr>
+        <w:tc>
+          <w:tcPr>
+            <w:tcW w:type="dxa" w:w="7776"/>
+            <w:tcBorders>
+              <w:top w:val="single" w:sz="4" w:color="C8CDC2"/>
+              <w:left w:val="single" w:sz="4" w:color="C8CDC2"/>
+              <w:bottom w:val="single" w:sz="4" w:color="C8CDC2"/>
+              <w:right w:val="single" w:sz="4" w:color="C8CDC2"/>
+            </w:tcBorders>
+            <w:vAlign w:val="center"/>
+            <w:tcMar>
+              <w:top w:w="10" w:type="dxa"/>
+              <w:left w:w="60" w:type="dxa"/>
+              <w:bottom w:w="10" w:type="dxa"/>
+              <w:right w:w="40" w:type="dxa"/>
+            </w:tcMar>
+          </w:tcPr>
+          <w:p>
+            <w:pPr>
+              <w:keepNext/>
+              <w:spacing w:after="0"/>
+            </w:pPr>
+            <w:r>
+              <w:rPr>
+                <w:rFonts w:ascii="Trade Gothic Next" w:hAnsi="Trade Gothic Next"/>
+                <w:b/>
+                <w:color w:val="14161B"/>
+                <w:sz w:val="20"/>
+                <w:u w:val="none"/>
+              </w:rPr>
+              <w:t>One orbital holds two electrons with opposite spins.</w:t>
+            </w:r>
+          </w:p>
+        </w:tc>
+        <w:tc>
+          <w:tcPr>
+            <w:tcW w:type="dxa" w:w="3024"/>
+            <w:tcBorders>
+              <w:top w:val="single" w:sz="4" w:color="C8CDC2"/>
+              <w:left w:val="single" w:sz="4" w:color="C8CDC2"/>
+              <w:bottom w:val="single" w:sz="4" w:color="C8CDC2"/>
+              <w:right w:val="single" w:sz="4" w:color="C8CDC2"/>
+            </w:tcBorders>
+            <w:vAlign w:val="center"/>
+            <w:tcMar>
+              <w:top w:w="10" w:type="dxa"/>
+              <w:left w:w="60" w:type="dxa"/>
+              <w:bottom w:w="10" w:type="dxa"/>
+              <w:right w:w="40" w:type="dxa"/>
+            </w:tcMar>
+          </w:tcPr>
+          <w:p>
+            <w:pPr>
+              <w:keepNext/>
+              <w:spacing w:after="0"/>
+            </w:pPr>
+          </w:p>
+        </w:tc>
+      </w:tr>
+      <w:tr>
+        <w:trPr>
+          <w:cantSplit/>
+          <w:trHeight w:val="432" w:hRule="atLeast"/>
+        </w:trPr>
+        <w:tc>
+          <w:tcPr>
+            <w:tcW w:type="dxa" w:w="7776"/>
+            <w:tcBorders>
+              <w:top w:val="single" w:sz="4" w:color="C8CDC2"/>
+              <w:left w:val="single" w:sz="4" w:color="C8CDC2"/>
+              <w:bottom w:val="single" w:sz="4" w:color="C8CDC2"/>
+              <w:right w:val="single" w:sz="4" w:color="C8CDC2"/>
+            </w:tcBorders>
+            <w:vAlign w:val="center"/>
+            <w:tcMar>
+              <w:top w:w="10" w:type="dxa"/>
+              <w:left w:w="60" w:type="dxa"/>
+              <w:bottom w:w="10" w:type="dxa"/>
+              <w:right w:w="40" w:type="dxa"/>
+            </w:tcMar>
+          </w:tcPr>
+          <w:p>
+            <w:pPr>
+              <w:spacing w:after="0"/>
+            </w:pPr>
+            <w:r>
+              <w:rPr>
+                <w:rFonts w:ascii="Trade Gothic Next" w:hAnsi="Trade Gothic Next"/>
+                <w:b/>
+                <w:color w:val="14161B"/>
+                <w:sz w:val="20"/>
+                <w:u w:val="none"/>
+              </w:rPr>
+              <w:t>Put one electron in each orbital of a sublevel before pairing.</w:t>
+            </w:r>
+          </w:p>
+        </w:tc>
+        <w:tc>
+          <w:tcPr>
+            <w:tcW w:type="dxa" w:w="3024"/>
+            <w:tcBorders>
+              <w:top w:val="single" w:sz="4" w:color="C8CDC2"/>
+              <w:left w:val="single" w:sz="4" w:color="C8CDC2"/>
+              <w:bottom w:val="single" w:sz="4" w:color="C8CDC2"/>
+              <w:right w:val="single" w:sz="4" w:color="C8CDC2"/>
+            </w:tcBorders>
+            <w:vAlign w:val="center"/>
+            <w:tcMar>
+              <w:top w:w="10" w:type="dxa"/>
+              <w:left w:w="60" w:type="dxa"/>
+              <w:bottom w:w="10" w:type="dxa"/>
+              <w:right w:w="40" w:type="dxa"/>
+            </w:tcMar>
+          </w:tcPr>
+          <w:p>
+            <w:pPr>
+              <w:spacing w:after="0"/>
             </w:pPr>
           </w:p>
         </w:tc>
@@ -509,204 +1218,569 @@
                 <w:sz w:val="17"/>
                 <w:spacing w:val="26"/>
               </w:rPr>
-              <w:t>S2.2  ·  ENERGY LEVELS, SUBLEVELS &amp; ORBITALS</w:t>
+              <w:t>2  ·  LONGHAND CONFIGURATIONS &amp; ORBITAL DIAGRAMS</w:t>
             </w:r>
           </w:p>
         </w:tc>
       </w:tr>
     </w:tbl>
+    <w:p>
+      <w:pPr>
+        <w:spacing w:before="0" w:after="0" w:line="80" w:lineRule="exact"/>
+      </w:pPr>
+      <w:r>
+        <w:rPr>
+          <w:rFonts w:ascii="Trade Gothic Next" w:hAnsi="Trade Gothic Next"/>
+          <w:sz w:val="4"/>
+        </w:rPr>
+      </w:r>
+    </w:p>
     <w:tbl>
       <w:tblPr>
         <w:tblW w:type="auto" w:w="0"/>
-        <w:jc w:val="left"/>
         <w:tblLayout w:type="fixed"/>
         <w:tblLook w:firstColumn="1" w:firstRow="1" w:lastColumn="0" w:lastRow="0" w:noHBand="0" w:noVBand="1" w:val="04A0"/>
         <w:tblLayout w:type="fixed"/>
       </w:tblPr>
       <w:tblGrid>
-        <w:gridCol w:w="10800"/>
+        <w:gridCol w:w="648"/>
+        <w:gridCol w:w="1440"/>
+        <w:gridCol w:w="8712"/>
       </w:tblGrid>
       <w:tr>
+        <w:trPr>
+          <w:cantSplit/>
+          <w:trHeight w:val="489" w:hRule="atLeast"/>
+        </w:trPr>
         <w:tc>
           <w:tcPr>
-            <w:tcW w:type="dxa" w:w="10800"/>
+            <w:tcW w:type="dxa" w:w="648"/>
+            <w:vMerge w:val="restart"/>
+            <w:vAlign w:val="center"/>
+            <w:tcMar>
+              <w:top w:w="40" w:type="dxa"/>
+              <w:left w:w="20" w:type="dxa"/>
+              <w:bottom w:w="40" w:type="dxa"/>
+              <w:right w:w="20" w:type="dxa"/>
+            </w:tcMar>
+          </w:tcPr>
+          <w:p>
+            <w:pPr>
+              <w:spacing w:after="0"/>
+              <w:jc w:val="left"/>
+            </w:pPr>
+            <w:r>
+              <w:rPr>
+                <w:rFonts w:ascii="Trade Gothic Next" w:hAnsi="Trade Gothic Next"/>
+                <w:b/>
+                <w:color w:val="4D730E"/>
+                <w:sz w:val="26"/>
+                <w:u w:val="none"/>
+              </w:rPr>
+              <w:t>4</w:t>
+            </w:r>
+          </w:p>
+        </w:tc>
+        <w:tc>
+          <w:tcPr>
+            <w:tcW w:type="dxa" w:w="1440"/>
+            <w:vMerge w:val="restart"/>
+            <w:vAlign w:val="top"/>
+            <w:tcMar>
+              <w:top w:w="0" w:type="dxa"/>
+              <w:left w:w="0" w:type="dxa"/>
+              <w:bottom w:w="0" w:type="dxa"/>
+              <w:right w:w="0" w:type="dxa"/>
+            </w:tcMar>
+          </w:tcPr>
+          <w:p>
+            <w:pPr>
+              <w:spacing w:after="0"/>
+              <w:jc w:val="left"/>
+            </w:pPr>
+            <w:r>
+              <w:drawing>
+                <wp:inline xmlns:a="http://schemas.openxmlformats.org/drawingml/2006/main" xmlns:pic="http://schemas.openxmlformats.org/drawingml/2006/picture">
+                  <wp:extent cx="804672" cy="804672"/>
+                  <wp:docPr id="1" name="Picture 1"/>
+                  <wp:cNvGraphicFramePr>
+                    <a:graphicFrameLocks noChangeAspect="1"/>
+                  </wp:cNvGraphicFramePr>
+                  <a:graphic>
+                    <a:graphicData uri="http://schemas.openxmlformats.org/drawingml/2006/picture">
+                      <pic:pic>
+                        <pic:nvPicPr>
+                          <pic:cNvPr id="0" name="tile_32.png"/>
+                          <pic:cNvPicPr/>
+                        </pic:nvPicPr>
+                        <pic:blipFill>
+                          <a:blip r:embed="rId9"/>
+                          <a:stretch>
+                            <a:fillRect/>
+                          </a:stretch>
+                        </pic:blipFill>
+                        <pic:spPr>
+                          <a:xfrm>
+                            <a:off x="0" y="0"/>
+                            <a:ext cx="804672" cy="804672"/>
+                          </a:xfrm>
+                          <a:prstGeom prst="rect"/>
+                        </pic:spPr>
+                      </pic:pic>
+                    </a:graphicData>
+                  </a:graphic>
+                </wp:inline>
+              </w:drawing>
+            </w:r>
+          </w:p>
+        </w:tc>
+        <w:tc>
+          <w:tcPr>
+            <w:tcW w:type="dxa" w:w="8712"/>
+            <w:vAlign w:val="bottom"/>
+            <w:tcMar>
+              <w:top w:w="0" w:type="dxa"/>
+              <w:left w:w="80" w:type="dxa"/>
+              <w:bottom w:w="20" w:type="dxa"/>
+              <w:right w:w="60" w:type="dxa"/>
+            </w:tcMar>
             <w:tcBorders>
               <w:bottom w:val="single" w:sz="4" w:color="C8CDC2"/>
             </w:tcBorders>
+          </w:tcPr>
+          <w:p>
+            <w:pPr>
+              <w:tabs>
+                <w:tab w:pos="1656" w:val="left"/>
+                <w:tab w:pos="8568" w:val="right"/>
+              </w:tabs>
+              <w:spacing w:after="0"/>
+              <w:jc w:val="left"/>
+            </w:pPr>
+            <w:r>
+              <w:rPr>
+                <w:rFonts w:ascii="Trade Gothic Next" w:hAnsi="Trade Gothic Next"/>
+                <w:b/>
+                <w:color w:val="14161B"/>
+                <w:sz w:val="18"/>
+                <w:u w:val="none"/>
+              </w:rPr>
+              <w:t>Configuration</w:t>
+            </w:r>
+            <w:r>
+              <w:rPr>
+                <w:rFonts w:ascii="Trade Gothic Next" w:hAnsi="Trade Gothic Next"/>
+                <w:b w:val="0"/>
+                <w:sz w:val="18"/>
+                <w:u w:val="none"/>
+              </w:rPr>
+              <w:tab/>
+            </w:r>
+            <w:r>
+              <w:rPr>
+                <w:rFonts w:ascii="Trade Gothic Next" w:hAnsi="Trade Gothic Next"/>
+                <w:b/>
+                <w:color w:val="14161B"/>
+                <w:sz w:val="18"/>
+                <w:u w:val="none"/>
+              </w:rPr>
+              <w:tab/>
+              <w:t>Unpaired</w:t>
+            </w:r>
+            <w:r>
+              <w:rPr>
+                <w:rFonts w:ascii="Trade Gothic Next" w:hAnsi="Trade Gothic Next"/>
+                <w:b w:val="0"/>
+                <w:sz w:val="18"/>
+                <w:u w:val="none"/>
+              </w:rPr>
+              <w:t xml:space="preserve"> ____ </w:t>
+            </w:r>
+          </w:p>
+        </w:tc>
+      </w:tr>
+      <w:tr>
+        <w:trPr>
+          <w:cantSplit/>
+          <w:trHeight w:val="86" w:hRule="atLeast"/>
+        </w:trPr>
+        <w:tc>
+          <w:tcPr>
+            <w:tcW w:type="dxa" w:w="648"/>
+            <w:vMerge/>
+          </w:tcPr>
+          <w:p/>
+        </w:tc>
+        <w:tc>
+          <w:tcPr>
+            <w:tcW w:type="dxa" w:w="1440"/>
+            <w:vMerge/>
+          </w:tcPr>
+          <w:p/>
+        </w:tc>
+        <w:tc>
+          <w:tcPr>
+            <w:tcW w:type="dxa" w:w="8712"/>
+            <w:tcMar>
+              <w:top w:w="0" w:type="dxa"/>
+              <w:left w:w="0" w:type="dxa"/>
+              <w:bottom w:w="0" w:type="dxa"/>
+              <w:right w:w="0" w:type="dxa"/>
+            </w:tcMar>
+          </w:tcPr>
+          <w:p>
+            <w:pPr>
+              <w:spacing w:after="0"/>
+            </w:pPr>
+            <w:r>
+              <w:rPr>
+                <w:rFonts w:ascii="Trade Gothic Next" w:hAnsi="Trade Gothic Next"/>
+                <w:b w:val="0"/>
+                <w:sz w:val="4"/>
+                <w:u w:val="none"/>
+              </w:rPr>
+            </w:r>
+          </w:p>
+        </w:tc>
+      </w:tr>
+      <w:tr>
+        <w:trPr>
+          <w:cantSplit/>
+          <w:trHeight w:val="691" w:hRule="atLeast"/>
+        </w:trPr>
+        <w:tc>
+          <w:tcPr>
+            <w:tcW w:type="dxa" w:w="648"/>
+            <w:vMerge/>
+          </w:tcPr>
+          <w:p/>
+        </w:tc>
+        <w:tc>
+          <w:tcPr>
+            <w:tcW w:type="dxa" w:w="1440"/>
+            <w:vMerge/>
+          </w:tcPr>
+          <w:p/>
+        </w:tc>
+        <w:tc>
+          <w:tcPr>
+            <w:tcW w:type="dxa" w:w="8712"/>
+            <w:tcBorders>
+              <w:top w:val="single" w:sz="6" w:color="C8CDC2"/>
+              <w:left w:val="single" w:sz="6" w:color="C8CDC2"/>
+              <w:bottom w:val="single" w:sz="6" w:color="C8CDC2"/>
+              <w:right w:val="single" w:sz="6" w:color="C8CDC2"/>
+            </w:tcBorders>
+            <w:vAlign w:val="top"/>
             <w:tcMar>
               <w:top w:w="30" w:type="dxa"/>
-              <w:left w:w="40" w:type="dxa"/>
-              <w:bottom w:w="30" w:type="dxa"/>
+              <w:left w:w="80" w:type="dxa"/>
+              <w:bottom w:w="20" w:type="dxa"/>
               <w:right w:w="40" w:type="dxa"/>
             </w:tcMar>
           </w:tcPr>
           <w:p>
             <w:pPr>
               <w:spacing w:after="20"/>
-              <w:ind w:left="360" w:hanging="360"/>
+            </w:pPr>
+            <w:r>
+              <w:rPr>
+                <w:rFonts w:ascii="Trade Gothic Next" w:hAnsi="Trade Gothic Next"/>
+                <w:b w:val="0"/>
+                <w:color w:val="55604F"/>
+                <w:sz w:val="17"/>
+                <w:u w:val="none"/>
+              </w:rPr>
+              <w:t>Orbital diagram</w:t>
+            </w:r>
+          </w:p>
+        </w:tc>
+      </w:tr>
+    </w:tbl>
+    <w:p>
+      <w:pPr>
+        <w:spacing w:before="0" w:after="0" w:line="60" w:lineRule="exact"/>
+      </w:pPr>
+      <w:r>
+        <w:rPr>
+          <w:rFonts w:ascii="Trade Gothic Next" w:hAnsi="Trade Gothic Next"/>
+          <w:sz w:val="2"/>
+        </w:rPr>
+      </w:r>
+    </w:p>
+    <w:tbl>
+      <w:tblPr>
+        <w:tblW w:type="auto" w:w="0"/>
+        <w:tblLayout w:type="fixed"/>
+        <w:tblLook w:firstColumn="1" w:firstRow="1" w:lastColumn="0" w:lastRow="0" w:noHBand="0" w:noVBand="1" w:val="04A0"/>
+        <w:tblLayout w:type="fixed"/>
+      </w:tblPr>
+      <w:tblGrid>
+        <w:gridCol w:w="648"/>
+        <w:gridCol w:w="1440"/>
+        <w:gridCol w:w="8712"/>
+      </w:tblGrid>
+      <w:tr>
+        <w:trPr>
+          <w:cantSplit/>
+          <w:trHeight w:val="489" w:hRule="atLeast"/>
+        </w:trPr>
+        <w:tc>
+          <w:tcPr>
+            <w:tcW w:type="dxa" w:w="648"/>
+            <w:vMerge w:val="restart"/>
+            <w:vAlign w:val="center"/>
+            <w:tcMar>
+              <w:top w:w="40" w:type="dxa"/>
+              <w:left w:w="20" w:type="dxa"/>
+              <w:bottom w:w="40" w:type="dxa"/>
+              <w:right w:w="20" w:type="dxa"/>
+            </w:tcMar>
+          </w:tcPr>
+          <w:p>
+            <w:pPr>
+              <w:spacing w:after="0"/>
+              <w:jc w:val="left"/>
             </w:pPr>
             <w:r>
               <w:rPr>
                 <w:rFonts w:ascii="Trade Gothic Next" w:hAnsi="Trade Gothic Next"/>
                 <w:b/>
                 <w:color w:val="4D730E"/>
-                <w:sz w:val="20"/>
+                <w:sz w:val="26"/>
                 <w:u w:val="none"/>
               </w:rPr>
-              <w:t xml:space="preserve">3   </w:t>
+              <w:t>5</w:t>
+            </w:r>
+          </w:p>
+        </w:tc>
+        <w:tc>
+          <w:tcPr>
+            <w:tcW w:type="dxa" w:w="1440"/>
+            <w:vMerge w:val="restart"/>
+            <w:vAlign w:val="top"/>
+            <w:tcMar>
+              <w:top w:w="0" w:type="dxa"/>
+              <w:left w:w="0" w:type="dxa"/>
+              <w:bottom w:w="0" w:type="dxa"/>
+              <w:right w:w="0" w:type="dxa"/>
+            </w:tcMar>
+          </w:tcPr>
+          <w:p>
+            <w:pPr>
+              <w:spacing w:after="0"/>
+              <w:jc w:val="left"/>
+            </w:pPr>
+            <w:r>
+              <w:drawing>
+                <wp:inline xmlns:a="http://schemas.openxmlformats.org/drawingml/2006/main" xmlns:pic="http://schemas.openxmlformats.org/drawingml/2006/picture">
+                  <wp:extent cx="804672" cy="804672"/>
+                  <wp:docPr id="2" name="Picture 2"/>
+                  <wp:cNvGraphicFramePr>
+                    <a:graphicFrameLocks noChangeAspect="1"/>
+                  </wp:cNvGraphicFramePr>
+                  <a:graphic>
+                    <a:graphicData uri="http://schemas.openxmlformats.org/drawingml/2006/picture">
+                      <pic:pic>
+                        <pic:nvPicPr>
+                          <pic:cNvPr id="0" name="tile_14.png"/>
+                          <pic:cNvPicPr/>
+                        </pic:nvPicPr>
+                        <pic:blipFill>
+                          <a:blip r:embed="rId10"/>
+                          <a:stretch>
+                            <a:fillRect/>
+                          </a:stretch>
+                        </pic:blipFill>
+                        <pic:spPr>
+                          <a:xfrm>
+                            <a:off x="0" y="0"/>
+                            <a:ext cx="804672" cy="804672"/>
+                          </a:xfrm>
+                          <a:prstGeom prst="rect"/>
+                        </pic:spPr>
+                      </pic:pic>
+                    </a:graphicData>
+                  </a:graphic>
+                </wp:inline>
+              </w:drawing>
+            </w:r>
+          </w:p>
+        </w:tc>
+        <w:tc>
+          <w:tcPr>
+            <w:tcW w:type="dxa" w:w="8712"/>
+            <w:vAlign w:val="bottom"/>
+            <w:tcMar>
+              <w:top w:w="0" w:type="dxa"/>
+              <w:left w:w="80" w:type="dxa"/>
+              <w:bottom w:w="20" w:type="dxa"/>
+              <w:right w:w="60" w:type="dxa"/>
+            </w:tcMar>
+            <w:tcBorders>
+              <w:bottom w:val="single" w:sz="4" w:color="C8CDC2"/>
+            </w:tcBorders>
+          </w:tcPr>
+          <w:p>
+            <w:pPr>
+              <w:tabs>
+                <w:tab w:pos="1656" w:val="left"/>
+                <w:tab w:pos="8568" w:val="right"/>
+              </w:tabs>
+              <w:spacing w:after="0"/>
+              <w:jc w:val="left"/>
+            </w:pPr>
+            <w:r>
+              <w:rPr>
+                <w:rFonts w:ascii="Trade Gothic Next" w:hAnsi="Trade Gothic Next"/>
+                <w:b/>
+                <w:color w:val="14161B"/>
+                <w:sz w:val="18"/>
+                <w:u w:val="none"/>
+              </w:rPr>
+              <w:t>Configuration</w:t>
             </w:r>
             <w:r>
               <w:rPr>
                 <w:rFonts w:ascii="Trade Gothic Next" w:hAnsi="Trade Gothic Next"/>
                 <w:b w:val="0"/>
-                <w:color w:val="14161B"/>
-                <w:sz w:val="20"/>
+                <w:sz w:val="18"/>
                 <w:u w:val="none"/>
               </w:rPr>
-              <w:t>List the sublevels in n = 4.</w:t>
+              <w:tab/>
             </w:r>
-          </w:p>
-          <w:tbl>
-            <w:tblPr>
-              <w:tblW w:type="auto" w:w="0"/>
-              <w:tblLayout w:type="fixed"/>
-              <w:tblLook w:firstColumn="1" w:firstRow="1" w:lastColumn="0" w:lastRow="0" w:noHBand="0" w:noVBand="1" w:val="04A0"/>
-              <w:tblLayout w:type="fixed"/>
-            </w:tblPr>
-            <w:tblGrid>
-              <w:gridCol w:w="10152"/>
-            </w:tblGrid>
-            <w:tr>
-              <w:trPr>
-                <w:cantSplit/>
-                <w:trHeight w:val="460" w:hRule="atLeast"/>
-              </w:trPr>
-              <w:tc>
-                <w:tcPr>
-                  <w:tcW w:type="dxa" w:w="10152"/>
-                  <w:vAlign w:val="bottom"/>
-                  <w:tcBorders>
-                    <w:bottom w:val="single" w:sz="6" w:color="C8CDC2"/>
-                  </w:tcBorders>
-                  <w:tcMar>
-                    <w:top w:w="0" w:type="dxa"/>
-                    <w:left w:w="60" w:type="dxa"/>
-                    <w:bottom w:w="10" w:type="dxa"/>
-                    <w:right w:w="0" w:type="dxa"/>
-                  </w:tcMar>
-                </w:tcPr>
-                <w:p>
-                  <w:pPr>
-                    <w:spacing w:after="0"/>
-                  </w:pPr>
-                </w:p>
-              </w:tc>
-            </w:tr>
-          </w:tbl>
-          <w:p>
-            <w:pPr>
-              <w:spacing w:before="0" w:after="0" w:line="20" w:lineRule="exact"/>
-            </w:pPr>
+            <w:r>
+              <w:rPr>
+                <w:rFonts w:ascii="Trade Gothic Next" w:hAnsi="Trade Gothic Next"/>
+                <w:b/>
+                <w:color w:val="14161B"/>
+                <w:sz w:val="18"/>
+                <w:u w:val="none"/>
+              </w:rPr>
+              <w:tab/>
+              <w:t>Unpaired</w:t>
+            </w:r>
+            <w:r>
+              <w:rPr>
+                <w:rFonts w:ascii="Trade Gothic Next" w:hAnsi="Trade Gothic Next"/>
+                <w:b w:val="0"/>
+                <w:sz w:val="18"/>
+                <w:u w:val="none"/>
+              </w:rPr>
+              <w:t xml:space="preserve"> ____ </w:t>
+            </w:r>
           </w:p>
         </w:tc>
       </w:tr>
-    </w:tbl>
-    <w:tbl>
-      <w:tblPr>
-        <w:tblW w:type="auto" w:w="0"/>
-        <w:jc w:val="left"/>
-        <w:tblLayout w:type="fixed"/>
-        <w:tblLook w:firstColumn="1" w:firstRow="1" w:lastColumn="0" w:lastRow="0" w:noHBand="0" w:noVBand="1" w:val="04A0"/>
-        <w:tblLayout w:type="fixed"/>
-      </w:tblPr>
-      <w:tblGrid>
-        <w:gridCol w:w="10800"/>
-      </w:tblGrid>
       <w:tr>
+        <w:trPr>
+          <w:cantSplit/>
+          <w:trHeight w:val="86" w:hRule="atLeast"/>
+        </w:trPr>
         <w:tc>
           <w:tcPr>
-            <w:tcW w:type="dxa" w:w="10800"/>
+            <w:tcW w:type="dxa" w:w="648"/>
+            <w:vMerge/>
+          </w:tcPr>
+          <w:p/>
+        </w:tc>
+        <w:tc>
+          <w:tcPr>
+            <w:tcW w:type="dxa" w:w="1440"/>
+            <w:vMerge/>
+          </w:tcPr>
+          <w:p/>
+        </w:tc>
+        <w:tc>
+          <w:tcPr>
+            <w:tcW w:type="dxa" w:w="8712"/>
+            <w:tcMar>
+              <w:top w:w="0" w:type="dxa"/>
+              <w:left w:w="0" w:type="dxa"/>
+              <w:bottom w:w="0" w:type="dxa"/>
+              <w:right w:w="0" w:type="dxa"/>
+            </w:tcMar>
+          </w:tcPr>
+          <w:p>
+            <w:pPr>
+              <w:spacing w:after="0"/>
+            </w:pPr>
+            <w:r>
+              <w:rPr>
+                <w:rFonts w:ascii="Trade Gothic Next" w:hAnsi="Trade Gothic Next"/>
+                <w:b w:val="0"/>
+                <w:sz w:val="4"/>
+                <w:u w:val="none"/>
+              </w:rPr>
+            </w:r>
+          </w:p>
+        </w:tc>
+      </w:tr>
+      <w:tr>
+        <w:trPr>
+          <w:cantSplit/>
+          <w:trHeight w:val="691" w:hRule="atLeast"/>
+        </w:trPr>
+        <w:tc>
+          <w:tcPr>
+            <w:tcW w:type="dxa" w:w="648"/>
+            <w:vMerge/>
+          </w:tcPr>
+          <w:p/>
+        </w:tc>
+        <w:tc>
+          <w:tcPr>
+            <w:tcW w:type="dxa" w:w="1440"/>
+            <w:vMerge/>
+          </w:tcPr>
+          <w:p/>
+        </w:tc>
+        <w:tc>
+          <w:tcPr>
+            <w:tcW w:type="dxa" w:w="8712"/>
             <w:tcBorders>
-              <w:bottom w:val="single" w:sz="4" w:color="C8CDC2"/>
+              <w:top w:val="single" w:sz="6" w:color="C8CDC2"/>
+              <w:left w:val="single" w:sz="6" w:color="C8CDC2"/>
+              <w:bottom w:val="single" w:sz="6" w:color="C8CDC2"/>
+              <w:right w:val="single" w:sz="6" w:color="C8CDC2"/>
             </w:tcBorders>
+            <w:vAlign w:val="top"/>
             <w:tcMar>
               <w:top w:w="30" w:type="dxa"/>
-              <w:left w:w="40" w:type="dxa"/>
-              <w:bottom w:w="30" w:type="dxa"/>
+              <w:left w:w="80" w:type="dxa"/>
+              <w:bottom w:w="20" w:type="dxa"/>
               <w:right w:w="40" w:type="dxa"/>
             </w:tcMar>
           </w:tcPr>
           <w:p>
             <w:pPr>
               <w:spacing w:after="20"/>
-              <w:ind w:left="360" w:hanging="360"/>
             </w:pPr>
             <w:r>
               <w:rPr>
                 <w:rFonts w:ascii="Trade Gothic Next" w:hAnsi="Trade Gothic Next"/>
-                <w:b/>
-                <w:color w:val="4D730E"/>
-                <w:sz w:val="20"/>
+                <w:b w:val="0"/>
+                <w:color w:val="55604F"/>
+                <w:sz w:val="17"/>
                 <w:u w:val="none"/>
               </w:rPr>
-              <w:t xml:space="preserve">4   </w:t>
+              <w:t>Orbital diagram</w:t>
             </w:r>
-            <w:r>
-              <w:rPr>
-                <w:rFonts w:ascii="Trade Gothic Next" w:hAnsi="Trade Gothic Next"/>
-                <w:b w:val="0"/>
-                <w:color w:val="14161B"/>
-                <w:sz w:val="20"/>
-                <w:u w:val="none"/>
-              </w:rPr>
-              <w:t>How many electrons fit in one d sublevel? How many fit in all of n = 2?</w:t>
-            </w:r>
-          </w:p>
-          <w:tbl>
-            <w:tblPr>
-              <w:tblW w:type="auto" w:w="0"/>
-              <w:tblLayout w:type="fixed"/>
-              <w:tblLook w:firstColumn="1" w:firstRow="1" w:lastColumn="0" w:lastRow="0" w:noHBand="0" w:noVBand="1" w:val="04A0"/>
-              <w:tblLayout w:type="fixed"/>
-            </w:tblPr>
-            <w:tblGrid>
-              <w:gridCol w:w="10152"/>
-            </w:tblGrid>
-            <w:tr>
-              <w:trPr>
-                <w:cantSplit/>
-                <w:trHeight w:val="460" w:hRule="atLeast"/>
-              </w:trPr>
-              <w:tc>
-                <w:tcPr>
-                  <w:tcW w:type="dxa" w:w="10152"/>
-                  <w:vAlign w:val="bottom"/>
-                  <w:tcBorders>
-                    <w:bottom w:val="single" w:sz="6" w:color="C8CDC2"/>
-                  </w:tcBorders>
-                  <w:tcMar>
-                    <w:top w:w="0" w:type="dxa"/>
-                    <w:left w:w="60" w:type="dxa"/>
-                    <w:bottom w:w="10" w:type="dxa"/>
-                    <w:right w:w="0" w:type="dxa"/>
-                  </w:tcMar>
-                </w:tcPr>
-                <w:p>
-                  <w:pPr>
-                    <w:spacing w:after="0"/>
-                  </w:pPr>
-                </w:p>
-              </w:tc>
-            </w:tr>
-          </w:tbl>
-          <w:p>
-            <w:pPr>
-              <w:spacing w:before="0" w:after="0" w:line="20" w:lineRule="exact"/>
-            </w:pPr>
           </w:p>
         </w:tc>
       </w:tr>
     </w:tbl>
+    <w:p>
+      <w:pPr>
+        <w:spacing w:before="0" w:after="0" w:line="60" w:lineRule="exact"/>
+      </w:pPr>
+      <w:r>
+        <w:rPr>
+          <w:rFonts w:ascii="Trade Gothic Next" w:hAnsi="Trade Gothic Next"/>
+          <w:sz w:val="2"/>
+        </w:rPr>
+      </w:r>
+    </w:p>
     <w:p>
       <w:pPr>
         <w:spacing w:before="0" w:after="0" w:line="80" w:lineRule="exact"/>
@@ -751,61 +1825,102 @@
                 <w:sz w:val="17"/>
                 <w:spacing w:val="26"/>
               </w:rPr>
-              <w:t>S2.3  ·  ELECTRON CONFIGURATIONS</w:t>
+              <w:t>3  ·  NOBLE-GAS SHORTHAND &amp; STABILITY EXCEPTIONS</w:t>
             </w:r>
           </w:p>
         </w:tc>
       </w:tr>
     </w:tbl>
+    <w:p>
+      <w:pPr>
+        <w:spacing w:before="0" w:after="0" w:line="40" w:lineRule="exact"/>
+      </w:pPr>
+      <w:r>
+        <w:rPr>
+          <w:rFonts w:ascii="Trade Gothic Next" w:hAnsi="Trade Gothic Next"/>
+          <w:sz w:val="2"/>
+        </w:rPr>
+      </w:r>
+    </w:p>
     <w:tbl>
       <w:tblPr>
         <w:tblW w:type="auto" w:w="0"/>
-        <w:jc w:val="left"/>
         <w:tblLayout w:type="fixed"/>
         <w:tblLook w:firstColumn="1" w:firstRow="1" w:lastColumn="0" w:lastRow="0" w:noHBand="0" w:noVBand="1" w:val="04A0"/>
         <w:tblLayout w:type="fixed"/>
       </w:tblPr>
       <w:tblGrid>
-        <w:gridCol w:w="10800"/>
+        <w:gridCol w:w="3600"/>
+        <w:gridCol w:w="3600"/>
+        <w:gridCol w:w="3600"/>
       </w:tblGrid>
       <w:tr>
+        <w:trPr>
+          <w:cantSplit/>
+        </w:trPr>
         <w:tc>
           <w:tcPr>
-            <w:tcW w:type="dxa" w:w="10800"/>
-            <w:tcBorders>
-              <w:bottom w:val="single" w:sz="4" w:color="C8CDC2"/>
-            </w:tcBorders>
+            <w:tcW w:type="dxa" w:w="3600"/>
+            <w:vAlign w:val="top"/>
             <w:tcMar>
-              <w:top w:w="30" w:type="dxa"/>
-              <w:left w:w="40" w:type="dxa"/>
-              <w:bottom w:w="30" w:type="dxa"/>
-              <w:right w:w="40" w:type="dxa"/>
+              <w:top w:w="0" w:type="dxa"/>
+              <w:left w:w="0" w:type="dxa"/>
+              <w:bottom w:w="0" w:type="dxa"/>
+              <w:right w:w="120" w:type="dxa"/>
             </w:tcMar>
           </w:tcPr>
           <w:p>
             <w:pPr>
               <w:spacing w:after="20"/>
-              <w:ind w:left="360" w:hanging="360"/>
             </w:pPr>
             <w:r>
               <w:rPr>
                 <w:rFonts w:ascii="Trade Gothic Next" w:hAnsi="Trade Gothic Next"/>
                 <w:b/>
                 <w:color w:val="4D730E"/>
-                <w:sz w:val="20"/>
+                <w:sz w:val="24"/>
                 <w:u w:val="none"/>
               </w:rPr>
-              <w:t xml:space="preserve">5   </w:t>
+              <w:t>6</w:t>
             </w:r>
+          </w:p>
+          <w:p>
+            <w:pPr>
+              <w:spacing w:after="40"/>
+            </w:pPr>
             <w:r>
-              <w:rPr>
-                <w:rFonts w:ascii="Trade Gothic Next" w:hAnsi="Trade Gothic Next"/>
-                <w:b w:val="0"/>
-                <w:color w:val="14161B"/>
-                <w:sz w:val="20"/>
-                <w:u w:val="none"/>
-              </w:rPr>
-              <w:t>Write the longhand configuration for krypton, Kr.</w:t>
+              <w:drawing>
+                <wp:inline xmlns:a="http://schemas.openxmlformats.org/drawingml/2006/main" xmlns:pic="http://schemas.openxmlformats.org/drawingml/2006/picture">
+                  <wp:extent cx="658368" cy="658368"/>
+                  <wp:docPr id="3" name="Picture 3"/>
+                  <wp:cNvGraphicFramePr>
+                    <a:graphicFrameLocks noChangeAspect="1"/>
+                  </wp:cNvGraphicFramePr>
+                  <a:graphic>
+                    <a:graphicData uri="http://schemas.openxmlformats.org/drawingml/2006/picture">
+                      <pic:pic>
+                        <pic:nvPicPr>
+                          <pic:cNvPr id="0" name="tile_40.png"/>
+                          <pic:cNvPicPr/>
+                        </pic:nvPicPr>
+                        <pic:blipFill>
+                          <a:blip r:embed="rId11"/>
+                          <a:stretch>
+                            <a:fillRect/>
+                          </a:stretch>
+                        </pic:blipFill>
+                        <pic:spPr>
+                          <a:xfrm>
+                            <a:off x="0" y="0"/>
+                            <a:ext cx="658368" cy="658368"/>
+                          </a:xfrm>
+                          <a:prstGeom prst="rect"/>
+                        </pic:spPr>
+                      </pic:pic>
+                    </a:graphicData>
+                  </a:graphic>
+                </wp:inline>
+              </w:drawing>
             </w:r>
           </w:p>
           <w:tbl>
@@ -816,24 +1931,240 @@
               <w:tblLayout w:type="fixed"/>
             </w:tblPr>
             <w:tblGrid>
-              <w:gridCol w:w="10152"/>
+              <w:gridCol w:w="3384"/>
             </w:tblGrid>
             <w:tr>
               <w:trPr>
                 <w:cantSplit/>
-                <w:trHeight w:val="460" w:hRule="atLeast"/>
+                <w:trHeight w:val="489" w:hRule="atLeast"/>
               </w:trPr>
               <w:tc>
                 <w:tcPr>
-                  <w:tcW w:type="dxa" w:w="10152"/>
+                  <w:tcW w:type="dxa" w:w="3384"/>
                   <w:vAlign w:val="bottom"/>
                   <w:tcBorders>
                     <w:bottom w:val="single" w:sz="6" w:color="C8CDC2"/>
                   </w:tcBorders>
                   <w:tcMar>
                     <w:top w:w="0" w:type="dxa"/>
-                    <w:left w:w="60" w:type="dxa"/>
-                    <w:bottom w:w="10" w:type="dxa"/>
+                    <w:left w:w="40" w:type="dxa"/>
+                    <w:bottom w:w="20" w:type="dxa"/>
+                    <w:right w:w="0" w:type="dxa"/>
+                  </w:tcMar>
+                </w:tcPr>
+                <w:p>
+                  <w:pPr>
+                    <w:spacing w:after="0"/>
+                  </w:pPr>
+                </w:p>
+              </w:tc>
+            </w:tr>
+          </w:tbl>
+          <w:p>
+            <w:pPr>
+              <w:spacing w:before="0" w:after="0" w:line="20" w:lineRule="exact"/>
+            </w:pPr>
+          </w:p>
+        </w:tc>
+        <w:tc>
+          <w:tcPr>
+            <w:tcW w:type="dxa" w:w="3600"/>
+            <w:vAlign w:val="top"/>
+            <w:tcMar>
+              <w:top w:w="0" w:type="dxa"/>
+              <w:left w:w="0" w:type="dxa"/>
+              <w:bottom w:w="0" w:type="dxa"/>
+              <w:right w:w="120" w:type="dxa"/>
+            </w:tcMar>
+          </w:tcPr>
+          <w:p>
+            <w:pPr>
+              <w:spacing w:after="20"/>
+            </w:pPr>
+            <w:r>
+              <w:rPr>
+                <w:rFonts w:ascii="Trade Gothic Next" w:hAnsi="Trade Gothic Next"/>
+                <w:b/>
+                <w:color w:val="4D730E"/>
+                <w:sz w:val="24"/>
+                <w:u w:val="none"/>
+              </w:rPr>
+              <w:t>7</w:t>
+            </w:r>
+          </w:p>
+          <w:p>
+            <w:pPr>
+              <w:spacing w:after="40"/>
+            </w:pPr>
+            <w:r>
+              <w:drawing>
+                <wp:inline xmlns:a="http://schemas.openxmlformats.org/drawingml/2006/main" xmlns:pic="http://schemas.openxmlformats.org/drawingml/2006/picture">
+                  <wp:extent cx="658368" cy="658368"/>
+                  <wp:docPr id="4" name="Picture 4"/>
+                  <wp:cNvGraphicFramePr>
+                    <a:graphicFrameLocks noChangeAspect="1"/>
+                  </wp:cNvGraphicFramePr>
+                  <a:graphic>
+                    <a:graphicData uri="http://schemas.openxmlformats.org/drawingml/2006/picture">
+                      <pic:pic>
+                        <pic:nvPicPr>
+                          <pic:cNvPr id="0" name="tile_82.png"/>
+                          <pic:cNvPicPr/>
+                        </pic:nvPicPr>
+                        <pic:blipFill>
+                          <a:blip r:embed="rId12"/>
+                          <a:stretch>
+                            <a:fillRect/>
+                          </a:stretch>
+                        </pic:blipFill>
+                        <pic:spPr>
+                          <a:xfrm>
+                            <a:off x="0" y="0"/>
+                            <a:ext cx="658368" cy="658368"/>
+                          </a:xfrm>
+                          <a:prstGeom prst="rect"/>
+                        </pic:spPr>
+                      </pic:pic>
+                    </a:graphicData>
+                  </a:graphic>
+                </wp:inline>
+              </w:drawing>
+            </w:r>
+          </w:p>
+          <w:tbl>
+            <w:tblPr>
+              <w:tblW w:type="auto" w:w="0"/>
+              <w:tblLayout w:type="fixed"/>
+              <w:tblLook w:firstColumn="1" w:firstRow="1" w:lastColumn="0" w:lastRow="0" w:noHBand="0" w:noVBand="1" w:val="04A0"/>
+              <w:tblLayout w:type="fixed"/>
+            </w:tblPr>
+            <w:tblGrid>
+              <w:gridCol w:w="3384"/>
+            </w:tblGrid>
+            <w:tr>
+              <w:trPr>
+                <w:cantSplit/>
+                <w:trHeight w:val="489" w:hRule="atLeast"/>
+              </w:trPr>
+              <w:tc>
+                <w:tcPr>
+                  <w:tcW w:type="dxa" w:w="3384"/>
+                  <w:vAlign w:val="bottom"/>
+                  <w:tcBorders>
+                    <w:bottom w:val="single" w:sz="6" w:color="C8CDC2"/>
+                  </w:tcBorders>
+                  <w:tcMar>
+                    <w:top w:w="0" w:type="dxa"/>
+                    <w:left w:w="40" w:type="dxa"/>
+                    <w:bottom w:w="20" w:type="dxa"/>
+                    <w:right w:w="0" w:type="dxa"/>
+                  </w:tcMar>
+                </w:tcPr>
+                <w:p>
+                  <w:pPr>
+                    <w:spacing w:after="0"/>
+                  </w:pPr>
+                </w:p>
+              </w:tc>
+            </w:tr>
+          </w:tbl>
+          <w:p>
+            <w:pPr>
+              <w:spacing w:before="0" w:after="0" w:line="20" w:lineRule="exact"/>
+            </w:pPr>
+          </w:p>
+        </w:tc>
+        <w:tc>
+          <w:tcPr>
+            <w:tcW w:type="dxa" w:w="3600"/>
+            <w:vAlign w:val="top"/>
+            <w:tcMar>
+              <w:top w:w="0" w:type="dxa"/>
+              <w:left w:w="0" w:type="dxa"/>
+              <w:bottom w:w="0" w:type="dxa"/>
+              <w:right w:w="120" w:type="dxa"/>
+            </w:tcMar>
+          </w:tcPr>
+          <w:p>
+            <w:pPr>
+              <w:spacing w:after="20"/>
+            </w:pPr>
+            <w:r>
+              <w:rPr>
+                <w:rFonts w:ascii="Trade Gothic Next" w:hAnsi="Trade Gothic Next"/>
+                <w:b/>
+                <w:color w:val="4D730E"/>
+                <w:sz w:val="24"/>
+                <w:u w:val="none"/>
+              </w:rPr>
+              <w:t>8</w:t>
+            </w:r>
+          </w:p>
+          <w:p>
+            <w:pPr>
+              <w:spacing w:after="40"/>
+            </w:pPr>
+            <w:r>
+              <w:drawing>
+                <wp:inline xmlns:a="http://schemas.openxmlformats.org/drawingml/2006/main" xmlns:pic="http://schemas.openxmlformats.org/drawingml/2006/picture">
+                  <wp:extent cx="658368" cy="658368"/>
+                  <wp:docPr id="5" name="Picture 5"/>
+                  <wp:cNvGraphicFramePr>
+                    <a:graphicFrameLocks noChangeAspect="1"/>
+                  </wp:cNvGraphicFramePr>
+                  <a:graphic>
+                    <a:graphicData uri="http://schemas.openxmlformats.org/drawingml/2006/picture">
+                      <pic:pic>
+                        <pic:nvPicPr>
+                          <pic:cNvPr id="0" name="tile_29.png"/>
+                          <pic:cNvPicPr/>
+                        </pic:nvPicPr>
+                        <pic:blipFill>
+                          <a:blip r:embed="rId13"/>
+                          <a:stretch>
+                            <a:fillRect/>
+                          </a:stretch>
+                        </pic:blipFill>
+                        <pic:spPr>
+                          <a:xfrm>
+                            <a:off x="0" y="0"/>
+                            <a:ext cx="658368" cy="658368"/>
+                          </a:xfrm>
+                          <a:prstGeom prst="rect"/>
+                        </pic:spPr>
+                      </pic:pic>
+                    </a:graphicData>
+                  </a:graphic>
+                </wp:inline>
+              </w:drawing>
+            </w:r>
+          </w:p>
+          <w:tbl>
+            <w:tblPr>
+              <w:tblW w:type="auto" w:w="0"/>
+              <w:tblLayout w:type="fixed"/>
+              <w:tblLook w:firstColumn="1" w:firstRow="1" w:lastColumn="0" w:lastRow="0" w:noHBand="0" w:noVBand="1" w:val="04A0"/>
+              <w:tblLayout w:type="fixed"/>
+            </w:tblPr>
+            <w:tblGrid>
+              <w:gridCol w:w="3384"/>
+            </w:tblGrid>
+            <w:tr>
+              <w:trPr>
+                <w:cantSplit/>
+                <w:trHeight w:val="489" w:hRule="atLeast"/>
+              </w:trPr>
+              <w:tc>
+                <w:tcPr>
+                  <w:tcW w:type="dxa" w:w="3384"/>
+                  <w:vAlign w:val="bottom"/>
+                  <w:tcBorders>
+                    <w:bottom w:val="single" w:sz="6" w:color="C8CDC2"/>
+                  </w:tcBorders>
+                  <w:tcMar>
+                    <w:top w:w="0" w:type="dxa"/>
+                    <w:left w:w="40" w:type="dxa"/>
+                    <w:bottom w:w="20" w:type="dxa"/>
                     <w:right w:w="0" w:type="dxa"/>
                   </w:tcMar>
                 </w:tcPr>
@@ -853,263 +2184,17 @@
         </w:tc>
       </w:tr>
     </w:tbl>
-    <w:tbl>
-      <w:tblPr>
-        <w:tblW w:type="auto" w:w="0"/>
-        <w:jc w:val="left"/>
-        <w:tblLayout w:type="fixed"/>
-        <w:tblLook w:firstColumn="1" w:firstRow="1" w:lastColumn="0" w:lastRow="0" w:noHBand="0" w:noVBand="1" w:val="04A0"/>
-        <w:tblLayout w:type="fixed"/>
-      </w:tblPr>
-      <w:tblGrid>
-        <w:gridCol w:w="10800"/>
-      </w:tblGrid>
-      <w:tr>
-        <w:tc>
-          <w:tcPr>
-            <w:tcW w:type="dxa" w:w="10800"/>
-            <w:tcBorders>
-              <w:bottom w:val="single" w:sz="4" w:color="C8CDC2"/>
-            </w:tcBorders>
-            <w:tcMar>
-              <w:top w:w="30" w:type="dxa"/>
-              <w:left w:w="40" w:type="dxa"/>
-              <w:bottom w:w="30" w:type="dxa"/>
-              <w:right w:w="40" w:type="dxa"/>
-            </w:tcMar>
-          </w:tcPr>
-          <w:p>
-            <w:pPr>
-              <w:spacing w:after="20"/>
-              <w:ind w:left="360" w:hanging="360"/>
-            </w:pPr>
-            <w:r>
-              <w:rPr>
-                <w:rFonts w:ascii="Trade Gothic Next" w:hAnsi="Trade Gothic Next"/>
-                <w:b/>
-                <w:color w:val="4D730E"/>
-                <w:sz w:val="20"/>
-                <w:u w:val="none"/>
-              </w:rPr>
-              <w:t xml:space="preserve">6   </w:t>
-            </w:r>
-            <w:r>
-              <w:rPr>
-                <w:rFonts w:ascii="Trade Gothic Next" w:hAnsi="Trade Gothic Next"/>
-                <w:b w:val="0"/>
-                <w:color w:val="14161B"/>
-                <w:sz w:val="20"/>
-                <w:u w:val="none"/>
-              </w:rPr>
-              <w:t>Write the noble-gas shorthand for zirconium, Zr.</w:t>
-            </w:r>
-          </w:p>
-          <w:tbl>
-            <w:tblPr>
-              <w:tblW w:type="auto" w:w="0"/>
-              <w:tblLayout w:type="fixed"/>
-              <w:tblLook w:firstColumn="1" w:firstRow="1" w:lastColumn="0" w:lastRow="0" w:noHBand="0" w:noVBand="1" w:val="04A0"/>
-              <w:tblLayout w:type="fixed"/>
-            </w:tblPr>
-            <w:tblGrid>
-              <w:gridCol w:w="10152"/>
-            </w:tblGrid>
-            <w:tr>
-              <w:trPr>
-                <w:cantSplit/>
-                <w:trHeight w:val="460" w:hRule="atLeast"/>
-              </w:trPr>
-              <w:tc>
-                <w:tcPr>
-                  <w:tcW w:type="dxa" w:w="10152"/>
-                  <w:vAlign w:val="bottom"/>
-                  <w:tcBorders>
-                    <w:bottom w:val="single" w:sz="6" w:color="C8CDC2"/>
-                  </w:tcBorders>
-                  <w:tcMar>
-                    <w:top w:w="0" w:type="dxa"/>
-                    <w:left w:w="60" w:type="dxa"/>
-                    <w:bottom w:w="10" w:type="dxa"/>
-                    <w:right w:w="0" w:type="dxa"/>
-                  </w:tcMar>
-                </w:tcPr>
-                <w:p>
-                  <w:pPr>
-                    <w:spacing w:after="0"/>
-                  </w:pPr>
-                </w:p>
-              </w:tc>
-            </w:tr>
-          </w:tbl>
-          <w:p>
-            <w:pPr>
-              <w:spacing w:before="0" w:after="0" w:line="20" w:lineRule="exact"/>
-            </w:pPr>
-          </w:p>
-        </w:tc>
-      </w:tr>
-    </w:tbl>
-    <w:tbl>
-      <w:tblPr>
-        <w:tblW w:type="auto" w:w="0"/>
-        <w:jc w:val="left"/>
-        <w:tblLayout w:type="fixed"/>
-        <w:tblLook w:firstColumn="1" w:firstRow="1" w:lastColumn="0" w:lastRow="0" w:noHBand="0" w:noVBand="1" w:val="04A0"/>
-        <w:tblLayout w:type="fixed"/>
-      </w:tblPr>
-      <w:tblGrid>
-        <w:gridCol w:w="10800"/>
-      </w:tblGrid>
-      <w:tr>
-        <w:tc>
-          <w:tcPr>
-            <w:tcW w:type="dxa" w:w="10800"/>
-            <w:tcBorders>
-              <w:bottom w:val="single" w:sz="4" w:color="C8CDC2"/>
-            </w:tcBorders>
-            <w:tcMar>
-              <w:top w:w="30" w:type="dxa"/>
-              <w:left w:w="40" w:type="dxa"/>
-              <w:bottom w:w="30" w:type="dxa"/>
-              <w:right w:w="40" w:type="dxa"/>
-            </w:tcMar>
-          </w:tcPr>
-          <w:p>
-            <w:pPr>
-              <w:spacing w:after="20"/>
-              <w:ind w:left="360" w:hanging="360"/>
-            </w:pPr>
-            <w:r>
-              <w:rPr>
-                <w:rFonts w:ascii="Trade Gothic Next" w:hAnsi="Trade Gothic Next"/>
-                <w:b/>
-                <w:color w:val="4D730E"/>
-                <w:sz w:val="20"/>
-                <w:u w:val="none"/>
-              </w:rPr>
-              <w:t xml:space="preserve">7   </w:t>
-            </w:r>
-            <w:r>
-              <w:rPr>
-                <w:rFonts w:ascii="Trade Gothic Next" w:hAnsi="Trade Gothic Next"/>
-                <w:b w:val="0"/>
-                <w:color w:val="14161B"/>
-                <w:sz w:val="20"/>
-                <w:u w:val="none"/>
-              </w:rPr>
-              <w:t>Draw the orbital diagram for silicon, Si, and count its unpaired electrons.</w:t>
-            </w:r>
-          </w:p>
-          <w:p>
-            <w:pPr>
-              <w:spacing w:before="0" w:after="0" w:line="920" w:lineRule="exact"/>
-            </w:pPr>
-            <w:r>
-              <w:rPr>
-                <w:rFonts w:ascii="Trade Gothic Next" w:hAnsi="Trade Gothic Next"/>
-                <w:sz w:val="2"/>
-              </w:rPr>
-            </w:r>
-          </w:p>
-        </w:tc>
-      </w:tr>
-    </w:tbl>
-    <w:tbl>
-      <w:tblPr>
-        <w:tblW w:type="auto" w:w="0"/>
-        <w:jc w:val="left"/>
-        <w:tblLayout w:type="fixed"/>
-        <w:tblLook w:firstColumn="1" w:firstRow="1" w:lastColumn="0" w:lastRow="0" w:noHBand="0" w:noVBand="1" w:val="04A0"/>
-        <w:tblLayout w:type="fixed"/>
-      </w:tblPr>
-      <w:tblGrid>
-        <w:gridCol w:w="10800"/>
-      </w:tblGrid>
-      <w:tr>
-        <w:tc>
-          <w:tcPr>
-            <w:tcW w:type="dxa" w:w="10800"/>
-            <w:tcBorders>
-              <w:bottom w:val="single" w:sz="4" w:color="C8CDC2"/>
-            </w:tcBorders>
-            <w:tcMar>
-              <w:top w:w="30" w:type="dxa"/>
-              <w:left w:w="40" w:type="dxa"/>
-              <w:bottom w:w="30" w:type="dxa"/>
-              <w:right w:w="40" w:type="dxa"/>
-            </w:tcMar>
-          </w:tcPr>
-          <w:p>
-            <w:pPr>
-              <w:spacing w:after="20"/>
-              <w:ind w:left="360" w:hanging="360"/>
-            </w:pPr>
-            <w:r>
-              <w:rPr>
-                <w:rFonts w:ascii="Trade Gothic Next" w:hAnsi="Trade Gothic Next"/>
-                <w:b/>
-                <w:color w:val="4D730E"/>
-                <w:sz w:val="20"/>
-                <w:u w:val="none"/>
-              </w:rPr>
-              <w:t xml:space="preserve">8   </w:t>
-            </w:r>
-            <w:r>
-              <w:rPr>
-                <w:rFonts w:ascii="Trade Gothic Next" w:hAnsi="Trade Gothic Next"/>
-                <w:b w:val="0"/>
-                <w:color w:val="14161B"/>
-                <w:sz w:val="20"/>
-                <w:u w:val="none"/>
-              </w:rPr>
-              <w:t>A student draws carbon's 2p as [↑↓] [   ] [   ]. Which rule did they break?</w:t>
-            </w:r>
-          </w:p>
-          <w:tbl>
-            <w:tblPr>
-              <w:tblW w:type="auto" w:w="0"/>
-              <w:tblLayout w:type="fixed"/>
-              <w:tblLook w:firstColumn="1" w:firstRow="1" w:lastColumn="0" w:lastRow="0" w:noHBand="0" w:noVBand="1" w:val="04A0"/>
-              <w:tblLayout w:type="fixed"/>
-            </w:tblPr>
-            <w:tblGrid>
-              <w:gridCol w:w="10152"/>
-            </w:tblGrid>
-            <w:tr>
-              <w:trPr>
-                <w:cantSplit/>
-                <w:trHeight w:val="460" w:hRule="atLeast"/>
-              </w:trPr>
-              <w:tc>
-                <w:tcPr>
-                  <w:tcW w:type="dxa" w:w="10152"/>
-                  <w:vAlign w:val="bottom"/>
-                  <w:tcBorders>
-                    <w:bottom w:val="single" w:sz="6" w:color="C8CDC2"/>
-                  </w:tcBorders>
-                  <w:tcMar>
-                    <w:top w:w="0" w:type="dxa"/>
-                    <w:left w:w="60" w:type="dxa"/>
-                    <w:bottom w:w="10" w:type="dxa"/>
-                    <w:right w:w="0" w:type="dxa"/>
-                  </w:tcMar>
-                </w:tcPr>
-                <w:p>
-                  <w:pPr>
-                    <w:spacing w:after="0"/>
-                  </w:pPr>
-                </w:p>
-              </w:tc>
-            </w:tr>
-          </w:tbl>
-          <w:p>
-            <w:pPr>
-              <w:spacing w:before="0" w:after="0" w:line="20" w:lineRule="exact"/>
-            </w:pPr>
-          </w:p>
-        </w:tc>
-      </w:tr>
-    </w:tbl>
+    <w:p>
+      <w:pPr>
+        <w:spacing w:before="0" w:after="0" w:line="40" w:lineRule="exact"/>
+      </w:pPr>
+      <w:r>
+        <w:rPr>
+          <w:rFonts w:ascii="Trade Gothic Next" w:hAnsi="Trade Gothic Next"/>
+          <w:sz w:val="2"/>
+        </w:rPr>
+      </w:r>
+    </w:p>
     <w:tbl>
       <w:tblPr>
         <w:tblW w:type="auto" w:w="0"/>
@@ -1158,7 +2243,49 @@
                 <w:sz w:val="20"/>
                 <w:u w:val="none"/>
               </w:rPr>
-              <w:t>Write chromium's actual shorthand configuration. Why is it an exception?</w:t>
+              <w:t>Chromium is predicted to be [Ar] 4s</w:t>
+            </w:r>
+            <w:r>
+              <w:rPr>
+                <w:rFonts w:ascii="Trade Gothic Next" w:hAnsi="Trade Gothic Next"/>
+                <w:b w:val="0"/>
+                <w:color w:val="14161B"/>
+                <w:sz w:val="20"/>
+                <w:u w:val="none"/>
+                <w:vertAlign w:val="superscript"/>
+              </w:rPr>
+              <w:t>2</w:t>
+            </w:r>
+            <w:r>
+              <w:rPr>
+                <w:rFonts w:ascii="Trade Gothic Next" w:hAnsi="Trade Gothic Next"/>
+                <w:b w:val="0"/>
+                <w:color w:val="14161B"/>
+                <w:sz w:val="20"/>
+                <w:u w:val="none"/>
+              </w:rPr>
+              <w:t xml:space="preserve"> 3d</w:t>
+            </w:r>
+            <w:r>
+              <w:rPr>
+                <w:rFonts w:ascii="Trade Gothic Next" w:hAnsi="Trade Gothic Next"/>
+                <w:b w:val="0"/>
+                <w:color w:val="14161B"/>
+                <w:sz w:val="20"/>
+                <w:u w:val="none"/>
+                <w:vertAlign w:val="superscript"/>
+              </w:rPr>
+              <w:t>4</w:t>
+            </w:r>
+            <w:r>
+              <w:rPr>
+                <w:rFonts w:ascii="Trade Gothic Next" w:hAnsi="Trade Gothic Next"/>
+                <w:b w:val="0"/>
+                <w:color w:val="14161B"/>
+                <w:sz w:val="20"/>
+                <w:u w:val="none"/>
+              </w:rPr>
+              <w:t>. Write its actual configuration and explain why it changes.</w:t>
             </w:r>
           </w:p>
           <w:tbl>
@@ -1289,15 +2416,111 @@
                 <w:sz w:val="17"/>
                 <w:spacing w:val="26"/>
               </w:rPr>
-              <w:t>S2.4  ·  VALENCE ELECTRONS &amp; IONS</w:t>
+              <w:t>4  ·  VALENCE ELECTRONS</w:t>
             </w:r>
+          </w:p>
+        </w:tc>
+      </w:tr>
+    </w:tbl>
+    <w:tbl>
+      <w:tblPr>
+        <w:tblW w:type="auto" w:w="0"/>
+        <w:jc w:val="left"/>
+        <w:tblLayout w:type="fixed"/>
+        <w:tblLook w:firstColumn="1" w:firstRow="1" w:lastColumn="0" w:lastRow="0" w:noHBand="0" w:noVBand="1" w:val="04A0"/>
+        <w:tblLayout w:type="fixed"/>
+      </w:tblPr>
+      <w:tblGrid>
+        <w:gridCol w:w="10800"/>
+      </w:tblGrid>
+      <w:tr>
+        <w:tc>
+          <w:tcPr>
+            <w:tcW w:type="dxa" w:w="10800"/>
+            <w:tcBorders>
+              <w:bottom w:val="single" w:sz="4" w:color="C8CDC2"/>
+            </w:tcBorders>
+            <w:tcMar>
+              <w:top w:w="30" w:type="dxa"/>
+              <w:left w:w="40" w:type="dxa"/>
+              <w:bottom w:w="30" w:type="dxa"/>
+              <w:right w:w="40" w:type="dxa"/>
+            </w:tcMar>
+          </w:tcPr>
+          <w:p>
+            <w:pPr>
+              <w:spacing w:after="20"/>
+              <w:ind w:left="360" w:hanging="360"/>
+            </w:pPr>
+            <w:r>
+              <w:rPr>
+                <w:rFonts w:ascii="Trade Gothic Next" w:hAnsi="Trade Gothic Next"/>
+                <w:b/>
+                <w:color w:val="4D730E"/>
+                <w:sz w:val="20"/>
+                <w:u w:val="none"/>
+              </w:rPr>
+              <w:t xml:space="preserve">10   </w:t>
+            </w:r>
+            <w:r>
+              <w:rPr>
+                <w:rFonts w:ascii="Trade Gothic Next" w:hAnsi="Trade Gothic Next"/>
+                <w:b w:val="0"/>
+                <w:color w:val="14161B"/>
+                <w:sz w:val="20"/>
+                <w:u w:val="none"/>
+              </w:rPr>
+              <w:t>Which sublevels hold an atom's valence electrons? Why don't the d electrons in germanium count?</w:t>
+            </w:r>
+          </w:p>
+          <w:tbl>
+            <w:tblPr>
+              <w:tblW w:type="auto" w:w="0"/>
+              <w:tblLayout w:type="fixed"/>
+              <w:tblLook w:firstColumn="1" w:firstRow="1" w:lastColumn="0" w:lastRow="0" w:noHBand="0" w:noVBand="1" w:val="04A0"/>
+              <w:tblLayout w:type="fixed"/>
+            </w:tblPr>
+            <w:tblGrid>
+              <w:gridCol w:w="10152"/>
+            </w:tblGrid>
+            <w:tr>
+              <w:trPr>
+                <w:cantSplit/>
+                <w:trHeight w:val="460" w:hRule="atLeast"/>
+              </w:trPr>
+              <w:tc>
+                <w:tcPr>
+                  <w:tcW w:type="dxa" w:w="10152"/>
+                  <w:vAlign w:val="bottom"/>
+                  <w:tcBorders>
+                    <w:bottom w:val="single" w:sz="6" w:color="C8CDC2"/>
+                  </w:tcBorders>
+                  <w:tcMar>
+                    <w:top w:w="0" w:type="dxa"/>
+                    <w:left w:w="60" w:type="dxa"/>
+                    <w:bottom w:w="10" w:type="dxa"/>
+                    <w:right w:w="0" w:type="dxa"/>
+                  </w:tcMar>
+                </w:tcPr>
+                <w:p>
+                  <w:pPr>
+                    <w:spacing w:after="0"/>
+                  </w:pPr>
+                </w:p>
+              </w:tc>
+            </w:tr>
+          </w:tbl>
+          <w:p>
+            <w:pPr>
+              <w:spacing w:before="0" w:after="0" w:line="20" w:lineRule="exact"/>
+            </w:pPr>
           </w:p>
         </w:tc>
       </w:tr>
     </w:tbl>
     <w:p>
       <w:pPr>
-        <w:spacing w:before="0" w:after="0" w:line="40" w:lineRule="exact"/>
+        <w:spacing w:before="0" w:after="0" w:line="60" w:lineRule="exact"/>
       </w:pPr>
       <w:r>
         <w:rPr>
@@ -1309,19 +2532,72 @@
     <w:tbl>
       <w:tblPr>
         <w:tblW w:type="auto" w:w="0"/>
+        <w:jc w:val="left"/>
         <w:tblLayout w:type="fixed"/>
         <w:tblLook w:firstColumn="1" w:firstRow="1" w:lastColumn="0" w:lastRow="0" w:noHBand="0" w:noVBand="1" w:val="04A0"/>
         <w:tblLayout w:type="fixed"/>
       </w:tblPr>
       <w:tblGrid>
-        <w:gridCol w:w="3600"/>
-        <w:gridCol w:w="3600"/>
-        <w:gridCol w:w="3600"/>
+        <w:gridCol w:w="10800"/>
       </w:tblGrid>
       <w:tr>
         <w:tc>
           <w:tcPr>
-            <w:tcW w:type="dxa" w:w="3600"/>
+            <w:tcW w:type="dxa" w:w="10800"/>
+            <w:tcMar>
+              <w:top w:w="0" w:type="dxa"/>
+              <w:left w:w="40" w:type="dxa"/>
+              <w:bottom w:w="20" w:type="dxa"/>
+              <w:right w:w="40" w:type="dxa"/>
+            </w:tcMar>
+          </w:tcPr>
+          <w:p>
+            <w:pPr>
+              <w:spacing w:after="0"/>
+              <w:ind w:left="360" w:hanging="360"/>
+            </w:pPr>
+            <w:r>
+              <w:rPr>
+                <w:rFonts w:ascii="Trade Gothic Next" w:hAnsi="Trade Gothic Next"/>
+                <w:b/>
+                <w:color w:val="4D730E"/>
+                <w:sz w:val="20"/>
+                <w:u w:val="none"/>
+              </w:rPr>
+              <w:t xml:space="preserve">11   </w:t>
+            </w:r>
+            <w:r>
+              <w:rPr>
+                <w:rFonts w:ascii="Trade Gothic Next" w:hAnsi="Trade Gothic Next"/>
+                <w:b w:val="0"/>
+                <w:color w:val="14161B"/>
+                <w:sz w:val="20"/>
+                <w:u w:val="none"/>
+              </w:rPr>
+              <w:t>How many valence electrons does each atom have?</w:t>
+            </w:r>
+          </w:p>
+        </w:tc>
+      </w:tr>
+    </w:tbl>
+    <w:tbl>
+      <w:tblPr>
+        <w:tblW w:type="auto" w:w="0"/>
+        <w:tblLayout w:type="fixed"/>
+        <w:tblLook w:firstColumn="1" w:firstRow="1" w:lastColumn="0" w:lastRow="0" w:noHBand="0" w:noVBand="1" w:val="04A0"/>
+        <w:tblLayout w:type="fixed"/>
+      </w:tblPr>
+      <w:tblGrid>
+        <w:gridCol w:w="2160"/>
+        <w:gridCol w:w="2160"/>
+        <w:gridCol w:w="2160"/>
+        <w:gridCol w:w="2160"/>
+        <w:gridCol w:w="2160"/>
+      </w:tblGrid>
+      <w:tr>
+        <w:tc>
+          <w:tcPr>
+            <w:tcW w:type="dxa" w:w="2160"/>
             <w:tcBorders>
               <w:bottom w:val="single" w:sz="12" w:color="A3E635"/>
             </w:tcBorders>
@@ -1352,7 +2628,7 @@
         </w:tc>
         <w:tc>
           <w:tcPr>
-            <w:tcW w:type="dxa" w:w="3600"/>
+            <w:tcW w:type="dxa" w:w="2160"/>
             <w:tcBorders>
               <w:bottom w:val="single" w:sz="12" w:color="A3E635"/>
             </w:tcBorders>
@@ -1377,24 +2653,13 @@
                 <w:sz w:val="16"/>
                 <w:u w:val="none"/>
               </w:rPr>
-              <w:t>VALENCE e</w:t>
-            </w:r>
-            <w:r>
-              <w:rPr>
-                <w:rFonts w:ascii="Trade Gothic Next" w:hAnsi="Trade Gothic Next"/>
-                <w:b/>
-                <w:color w:val="4D730E"/>
-                <w:sz w:val="16"/>
-                <w:u w:val="none"/>
-                <w:vertAlign w:val="superscript"/>
-              </w:rPr>
-              <w:t>−</w:t>
+              <w:t>Cesium, Cs</w:t>
             </w:r>
           </w:p>
         </w:tc>
         <w:tc>
           <w:tcPr>
-            <w:tcW w:type="dxa" w:w="3600"/>
+            <w:tcW w:type="dxa" w:w="2160"/>
             <w:tcBorders>
               <w:bottom w:val="single" w:sz="12" w:color="A3E635"/>
             </w:tcBorders>
@@ -1419,7 +2684,423 @@
                 <w:sz w:val="16"/>
                 <w:u w:val="none"/>
               </w:rPr>
-              <w:t>ION IT FORMS</w:t>
+              <w:t>Boron, B</w:t>
+            </w:r>
+          </w:p>
+        </w:tc>
+        <w:tc>
+          <w:tcPr>
+            <w:tcW w:type="dxa" w:w="2160"/>
+            <w:tcBorders>
+              <w:bottom w:val="single" w:sz="12" w:color="A3E635"/>
+            </w:tcBorders>
+            <w:vAlign w:val="center"/>
+            <w:tcMar>
+              <w:top w:w="20" w:type="dxa"/>
+              <w:left w:w="60" w:type="dxa"/>
+              <w:bottom w:w="20" w:type="dxa"/>
+              <w:right w:w="40" w:type="dxa"/>
+            </w:tcMar>
+          </w:tcPr>
+          <w:p>
+            <w:pPr>
+              <w:keepNext/>
+              <w:spacing w:after="0"/>
+            </w:pPr>
+            <w:r>
+              <w:rPr>
+                <w:rFonts w:ascii="Trade Gothic Next" w:hAnsi="Trade Gothic Next"/>
+                <w:b/>
+                <w:color w:val="4D730E"/>
+                <w:sz w:val="16"/>
+                <w:u w:val="none"/>
+              </w:rPr>
+              <w:t>Bismuth, Bi</w:t>
+            </w:r>
+          </w:p>
+        </w:tc>
+        <w:tc>
+          <w:tcPr>
+            <w:tcW w:type="dxa" w:w="2160"/>
+            <w:tcBorders>
+              <w:bottom w:val="single" w:sz="12" w:color="A3E635"/>
+            </w:tcBorders>
+            <w:vAlign w:val="center"/>
+            <w:tcMar>
+              <w:top w:w="20" w:type="dxa"/>
+              <w:left w:w="60" w:type="dxa"/>
+              <w:bottom w:w="20" w:type="dxa"/>
+              <w:right w:w="40" w:type="dxa"/>
+            </w:tcMar>
+          </w:tcPr>
+          <w:p>
+            <w:pPr>
+              <w:keepNext/>
+              <w:spacing w:after="0"/>
+            </w:pPr>
+            <w:r>
+              <w:rPr>
+                <w:rFonts w:ascii="Trade Gothic Next" w:hAnsi="Trade Gothic Next"/>
+                <w:b/>
+                <w:color w:val="4D730E"/>
+                <w:sz w:val="16"/>
+                <w:u w:val="none"/>
+              </w:rPr>
+              <w:t>Xenon, Xe</w:t>
+            </w:r>
+          </w:p>
+        </w:tc>
+      </w:tr>
+      <w:tr>
+        <w:trPr>
+          <w:cantSplit/>
+          <w:trHeight w:val="489" w:hRule="atLeast"/>
+        </w:trPr>
+        <w:tc>
+          <w:tcPr>
+            <w:tcW w:type="dxa" w:w="2160"/>
+            <w:tcBorders>
+              <w:top w:val="single" w:sz="4" w:color="C8CDC2"/>
+              <w:left w:val="single" w:sz="4" w:color="C8CDC2"/>
+              <w:bottom w:val="single" w:sz="4" w:color="C8CDC2"/>
+              <w:right w:val="single" w:sz="4" w:color="C8CDC2"/>
+            </w:tcBorders>
+            <w:vAlign w:val="center"/>
+            <w:tcMar>
+              <w:top w:w="10" w:type="dxa"/>
+              <w:left w:w="60" w:type="dxa"/>
+              <w:bottom w:w="10" w:type="dxa"/>
+              <w:right w:w="40" w:type="dxa"/>
+            </w:tcMar>
+          </w:tcPr>
+          <w:p>
+            <w:pPr>
+              <w:spacing w:after="0"/>
+            </w:pPr>
+            <w:r>
+              <w:rPr>
+                <w:rFonts w:ascii="Trade Gothic Next" w:hAnsi="Trade Gothic Next"/>
+                <w:b/>
+                <w:color w:val="14161B"/>
+                <w:sz w:val="20"/>
+                <w:u w:val="none"/>
+              </w:rPr>
+              <w:t>Valence e</w:t>
+            </w:r>
+            <w:r>
+              <w:rPr>
+                <w:rFonts w:ascii="Trade Gothic Next" w:hAnsi="Trade Gothic Next"/>
+                <w:b/>
+                <w:color w:val="14161B"/>
+                <w:sz w:val="20"/>
+                <w:u w:val="none"/>
+                <w:vertAlign w:val="superscript"/>
+              </w:rPr>
+              <w:t>−</w:t>
+            </w:r>
+          </w:p>
+        </w:tc>
+        <w:tc>
+          <w:tcPr>
+            <w:tcW w:type="dxa" w:w="2160"/>
+            <w:tcBorders>
+              <w:top w:val="single" w:sz="4" w:color="C8CDC2"/>
+              <w:left w:val="single" w:sz="4" w:color="C8CDC2"/>
+              <w:bottom w:val="single" w:sz="4" w:color="C8CDC2"/>
+              <w:right w:val="single" w:sz="4" w:color="C8CDC2"/>
+            </w:tcBorders>
+            <w:vAlign w:val="center"/>
+            <w:tcMar>
+              <w:top w:w="10" w:type="dxa"/>
+              <w:left w:w="60" w:type="dxa"/>
+              <w:bottom w:w="10" w:type="dxa"/>
+              <w:right w:w="40" w:type="dxa"/>
+            </w:tcMar>
+          </w:tcPr>
+          <w:p>
+            <w:pPr>
+              <w:spacing w:after="0"/>
+            </w:pPr>
+          </w:p>
+        </w:tc>
+        <w:tc>
+          <w:tcPr>
+            <w:tcW w:type="dxa" w:w="2160"/>
+            <w:tcBorders>
+              <w:top w:val="single" w:sz="4" w:color="C8CDC2"/>
+              <w:left w:val="single" w:sz="4" w:color="C8CDC2"/>
+              <w:bottom w:val="single" w:sz="4" w:color="C8CDC2"/>
+              <w:right w:val="single" w:sz="4" w:color="C8CDC2"/>
+            </w:tcBorders>
+            <w:vAlign w:val="center"/>
+            <w:tcMar>
+              <w:top w:w="10" w:type="dxa"/>
+              <w:left w:w="60" w:type="dxa"/>
+              <w:bottom w:w="10" w:type="dxa"/>
+              <w:right w:w="40" w:type="dxa"/>
+            </w:tcMar>
+          </w:tcPr>
+          <w:p>
+            <w:pPr>
+              <w:spacing w:after="0"/>
+            </w:pPr>
+          </w:p>
+        </w:tc>
+        <w:tc>
+          <w:tcPr>
+            <w:tcW w:type="dxa" w:w="2160"/>
+            <w:tcBorders>
+              <w:top w:val="single" w:sz="4" w:color="C8CDC2"/>
+              <w:left w:val="single" w:sz="4" w:color="C8CDC2"/>
+              <w:bottom w:val="single" w:sz="4" w:color="C8CDC2"/>
+              <w:right w:val="single" w:sz="4" w:color="C8CDC2"/>
+            </w:tcBorders>
+            <w:vAlign w:val="center"/>
+            <w:tcMar>
+              <w:top w:w="10" w:type="dxa"/>
+              <w:left w:w="60" w:type="dxa"/>
+              <w:bottom w:w="10" w:type="dxa"/>
+              <w:right w:w="40" w:type="dxa"/>
+            </w:tcMar>
+          </w:tcPr>
+          <w:p>
+            <w:pPr>
+              <w:spacing w:after="0"/>
+            </w:pPr>
+          </w:p>
+        </w:tc>
+        <w:tc>
+          <w:tcPr>
+            <w:tcW w:type="dxa" w:w="2160"/>
+            <w:tcBorders>
+              <w:top w:val="single" w:sz="4" w:color="C8CDC2"/>
+              <w:left w:val="single" w:sz="4" w:color="C8CDC2"/>
+              <w:bottom w:val="single" w:sz="4" w:color="C8CDC2"/>
+              <w:right w:val="single" w:sz="4" w:color="C8CDC2"/>
+            </w:tcBorders>
+            <w:vAlign w:val="center"/>
+            <w:tcMar>
+              <w:top w:w="10" w:type="dxa"/>
+              <w:left w:w="60" w:type="dxa"/>
+              <w:bottom w:w="10" w:type="dxa"/>
+              <w:right w:w="40" w:type="dxa"/>
+            </w:tcMar>
+          </w:tcPr>
+          <w:p>
+            <w:pPr>
+              <w:spacing w:after="0"/>
+            </w:pPr>
+          </w:p>
+        </w:tc>
+      </w:tr>
+    </w:tbl>
+    <w:p>
+      <w:pPr>
+        <w:spacing w:before="0" w:after="0" w:line="80" w:lineRule="exact"/>
+      </w:pPr>
+      <w:r>
+        <w:rPr>
+          <w:rFonts w:ascii="Trade Gothic Next" w:hAnsi="Trade Gothic Next"/>
+          <w:sz w:val="4"/>
+        </w:rPr>
+      </w:r>
+    </w:p>
+    <w:tbl>
+      <w:tblPr>
+        <w:tblW w:type="auto" w:w="0"/>
+        <w:jc w:val="left"/>
+        <w:tblLayout w:type="fixed"/>
+        <w:tblLook w:firstColumn="1" w:firstRow="1" w:lastColumn="0" w:lastRow="0" w:noHBand="0" w:noVBand="1" w:val="04A0"/>
+        <w:tblLayout w:type="fixed"/>
+      </w:tblPr>
+      <w:tblGrid>
+        <w:gridCol w:w="10800"/>
+      </w:tblGrid>
+      <w:tr>
+        <w:tc>
+          <w:tcPr>
+            <w:tcW w:type="dxa" w:w="10800"/>
+            <w:tcBorders>
+              <w:top w:val="single" w:sz="12" w:color="14161B"/>
+              <w:bottom w:val="single" w:sz="18" w:color="A3E635"/>
+            </w:tcBorders>
+          </w:tcPr>
+          <w:p>
+            <w:pPr>
+              <w:keepNext/>
+              <w:spacing w:after="40" w:before="0"/>
+            </w:pPr>
+            <w:r>
+              <w:rPr>
+                <w:rFonts w:ascii="Trade Gothic Next" w:hAnsi="Trade Gothic Next"/>
+                <w:b/>
+                <w:color w:val="14161B"/>
+                <w:sz w:val="17"/>
+                <w:spacing w:val="26"/>
+              </w:rPr>
+              <w:t>5  ·  CATION &amp; ANION FORMATION</w:t>
+            </w:r>
+          </w:p>
+        </w:tc>
+      </w:tr>
+    </w:tbl>
+    <w:p>
+      <w:pPr>
+        <w:spacing w:before="0" w:after="0" w:line="40" w:lineRule="exact"/>
+      </w:pPr>
+      <w:r>
+        <w:rPr>
+          <w:rFonts w:ascii="Trade Gothic Next" w:hAnsi="Trade Gothic Next"/>
+          <w:sz w:val="2"/>
+        </w:rPr>
+      </w:r>
+    </w:p>
+    <w:tbl>
+      <w:tblPr>
+        <w:tblW w:type="auto" w:w="0"/>
+        <w:tblLayout w:type="fixed"/>
+        <w:tblLook w:firstColumn="1" w:firstRow="1" w:lastColumn="0" w:lastRow="0" w:noHBand="0" w:noVBand="1" w:val="04A0"/>
+        <w:tblLayout w:type="fixed"/>
+      </w:tblPr>
+      <w:tblGrid>
+        <w:gridCol w:w="2736"/>
+        <w:gridCol w:w="2880"/>
+        <w:gridCol w:w="2304"/>
+        <w:gridCol w:w="2880"/>
+      </w:tblGrid>
+      <w:tr>
+        <w:tc>
+          <w:tcPr>
+            <w:tcW w:type="dxa" w:w="2736"/>
+            <w:tcBorders>
+              <w:bottom w:val="single" w:sz="12" w:color="A3E635"/>
+            </w:tcBorders>
+            <w:vAlign w:val="center"/>
+            <w:tcMar>
+              <w:top w:w="20" w:type="dxa"/>
+              <w:left w:w="60" w:type="dxa"/>
+              <w:bottom w:w="20" w:type="dxa"/>
+              <w:right w:w="40" w:type="dxa"/>
+            </w:tcMar>
+          </w:tcPr>
+          <w:p>
+            <w:pPr>
+              <w:keepNext/>
+              <w:spacing w:after="0"/>
+            </w:pPr>
+            <w:r>
+              <w:rPr>
+                <w:rFonts w:ascii="Trade Gothic Next" w:hAnsi="Trade Gothic Next"/>
+                <w:b/>
+                <w:color w:val="4D730E"/>
+                <w:sz w:val="16"/>
+                <w:u w:val="none"/>
+              </w:rPr>
+              <w:t>ATOM</w:t>
+            </w:r>
+          </w:p>
+        </w:tc>
+        <w:tc>
+          <w:tcPr>
+            <w:tcW w:type="dxa" w:w="2880"/>
+            <w:tcBorders>
+              <w:bottom w:val="single" w:sz="12" w:color="A3E635"/>
+            </w:tcBorders>
+            <w:vAlign w:val="center"/>
+            <w:tcMar>
+              <w:top w:w="20" w:type="dxa"/>
+              <w:left w:w="60" w:type="dxa"/>
+              <w:bottom w:w="20" w:type="dxa"/>
+              <w:right w:w="40" w:type="dxa"/>
+            </w:tcMar>
+          </w:tcPr>
+          <w:p>
+            <w:pPr>
+              <w:keepNext/>
+              <w:spacing w:after="0"/>
+            </w:pPr>
+            <w:r>
+              <w:rPr>
+                <w:rFonts w:ascii="Trade Gothic Next" w:hAnsi="Trade Gothic Next"/>
+                <w:b/>
+                <w:color w:val="4D730E"/>
+                <w:sz w:val="16"/>
+                <w:u w:val="none"/>
+              </w:rPr>
+              <w:t>GAINS OR LOSES e</w:t>
+            </w:r>
+            <w:r>
+              <w:rPr>
+                <w:rFonts w:ascii="Trade Gothic Next" w:hAnsi="Trade Gothic Next"/>
+                <w:b/>
+                <w:color w:val="4D730E"/>
+                <w:sz w:val="16"/>
+                <w:u w:val="none"/>
+                <w:vertAlign w:val="superscript"/>
+              </w:rPr>
+              <w:t>−</w:t>
+            </w:r>
+          </w:p>
+        </w:tc>
+        <w:tc>
+          <w:tcPr>
+            <w:tcW w:type="dxa" w:w="2304"/>
+            <w:tcBorders>
+              <w:bottom w:val="single" w:sz="12" w:color="A3E635"/>
+            </w:tcBorders>
+            <w:vAlign w:val="center"/>
+            <w:tcMar>
+              <w:top w:w="20" w:type="dxa"/>
+              <w:left w:w="60" w:type="dxa"/>
+              <w:bottom w:w="20" w:type="dxa"/>
+              <w:right w:w="40" w:type="dxa"/>
+            </w:tcMar>
+          </w:tcPr>
+          <w:p>
+            <w:pPr>
+              <w:keepNext/>
+              <w:spacing w:after="0"/>
+            </w:pPr>
+            <w:r>
+              <w:rPr>
+                <w:rFonts w:ascii="Trade Gothic Next" w:hAnsi="Trade Gothic Next"/>
+                <w:b/>
+                <w:color w:val="4D730E"/>
+                <w:sz w:val="16"/>
+                <w:u w:val="none"/>
+              </w:rPr>
+              <w:t>ION CHARGE</w:t>
+            </w:r>
+          </w:p>
+        </w:tc>
+        <w:tc>
+          <w:tcPr>
+            <w:tcW w:type="dxa" w:w="2880"/>
+            <w:tcBorders>
+              <w:bottom w:val="single" w:sz="12" w:color="A3E635"/>
+            </w:tcBorders>
+            <w:vAlign w:val="center"/>
+            <w:tcMar>
+              <w:top w:w="20" w:type="dxa"/>
+              <w:left w:w="60" w:type="dxa"/>
+              <w:bottom w:w="20" w:type="dxa"/>
+              <w:right w:w="40" w:type="dxa"/>
+            </w:tcMar>
+          </w:tcPr>
+          <w:p>
+            <w:pPr>
+              <w:keepNext/>
+              <w:spacing w:after="0"/>
+            </w:pPr>
+            <w:r>
+              <w:rPr>
+                <w:rFonts w:ascii="Trade Gothic Next" w:hAnsi="Trade Gothic Next"/>
+                <w:b/>
+                <w:color w:val="4D730E"/>
+                <w:sz w:val="16"/>
+                <w:u w:val="none"/>
+              </w:rPr>
+              <w:t>CATION OR ANION</w:t>
             </w:r>
           </w:p>
         </w:tc>
@@ -1431,7 +3112,231 @@
         </w:trPr>
         <w:tc>
           <w:tcPr>
-            <w:tcW w:type="dxa" w:w="3600"/>
+            <w:tcW w:type="dxa" w:w="2736"/>
+            <w:tcBorders>
+              <w:top w:val="single" w:sz="4" w:color="C8CDC2"/>
+              <w:left w:val="single" w:sz="4" w:color="C8CDC2"/>
+              <w:bottom w:val="single" w:sz="4" w:color="C8CDC2"/>
+              <w:right w:val="single" w:sz="4" w:color="C8CDC2"/>
+            </w:tcBorders>
+            <w:vAlign w:val="center"/>
+            <w:tcMar>
+              <w:top w:w="10" w:type="dxa"/>
+              <w:left w:w="60" w:type="dxa"/>
+              <w:bottom w:w="10" w:type="dxa"/>
+              <w:right w:w="40" w:type="dxa"/>
+            </w:tcMar>
+          </w:tcPr>
+          <w:p>
+            <w:pPr>
+              <w:keepNext/>
+              <w:spacing w:after="0"/>
+            </w:pPr>
+            <w:r>
+              <w:rPr>
+                <w:rFonts w:ascii="Trade Gothic Next" w:hAnsi="Trade Gothic Next"/>
+                <w:b/>
+                <w:color w:val="14161B"/>
+                <w:sz w:val="20"/>
+                <w:u w:val="none"/>
+              </w:rPr>
+              <w:t>Lithium, Li</w:t>
+            </w:r>
+          </w:p>
+        </w:tc>
+        <w:tc>
+          <w:tcPr>
+            <w:tcW w:type="dxa" w:w="2880"/>
+            <w:tcBorders>
+              <w:top w:val="single" w:sz="4" w:color="C8CDC2"/>
+              <w:left w:val="single" w:sz="4" w:color="C8CDC2"/>
+              <w:bottom w:val="single" w:sz="4" w:color="C8CDC2"/>
+              <w:right w:val="single" w:sz="4" w:color="C8CDC2"/>
+            </w:tcBorders>
+            <w:vAlign w:val="center"/>
+            <w:tcMar>
+              <w:top w:w="10" w:type="dxa"/>
+              <w:left w:w="60" w:type="dxa"/>
+              <w:bottom w:w="10" w:type="dxa"/>
+              <w:right w:w="40" w:type="dxa"/>
+            </w:tcMar>
+          </w:tcPr>
+          <w:p>
+            <w:pPr>
+              <w:keepNext/>
+              <w:spacing w:after="0"/>
+            </w:pPr>
+          </w:p>
+        </w:tc>
+        <w:tc>
+          <w:tcPr>
+            <w:tcW w:type="dxa" w:w="2304"/>
+            <w:tcBorders>
+              <w:top w:val="single" w:sz="4" w:color="C8CDC2"/>
+              <w:left w:val="single" w:sz="4" w:color="C8CDC2"/>
+              <w:bottom w:val="single" w:sz="4" w:color="C8CDC2"/>
+              <w:right w:val="single" w:sz="4" w:color="C8CDC2"/>
+            </w:tcBorders>
+            <w:vAlign w:val="center"/>
+            <w:tcMar>
+              <w:top w:w="10" w:type="dxa"/>
+              <w:left w:w="60" w:type="dxa"/>
+              <w:bottom w:w="10" w:type="dxa"/>
+              <w:right w:w="40" w:type="dxa"/>
+            </w:tcMar>
+          </w:tcPr>
+          <w:p>
+            <w:pPr>
+              <w:keepNext/>
+              <w:spacing w:after="0"/>
+            </w:pPr>
+          </w:p>
+        </w:tc>
+        <w:tc>
+          <w:tcPr>
+            <w:tcW w:type="dxa" w:w="2880"/>
+            <w:tcBorders>
+              <w:top w:val="single" w:sz="4" w:color="C8CDC2"/>
+              <w:left w:val="single" w:sz="4" w:color="C8CDC2"/>
+              <w:bottom w:val="single" w:sz="4" w:color="C8CDC2"/>
+              <w:right w:val="single" w:sz="4" w:color="C8CDC2"/>
+            </w:tcBorders>
+            <w:vAlign w:val="center"/>
+            <w:tcMar>
+              <w:top w:w="10" w:type="dxa"/>
+              <w:left w:w="60" w:type="dxa"/>
+              <w:bottom w:w="10" w:type="dxa"/>
+              <w:right w:w="40" w:type="dxa"/>
+            </w:tcMar>
+          </w:tcPr>
+          <w:p>
+            <w:pPr>
+              <w:keepNext/>
+              <w:spacing w:after="0"/>
+            </w:pPr>
+          </w:p>
+        </w:tc>
+      </w:tr>
+      <w:tr>
+        <w:trPr>
+          <w:cantSplit/>
+          <w:trHeight w:val="460" w:hRule="atLeast"/>
+        </w:trPr>
+        <w:tc>
+          <w:tcPr>
+            <w:tcW w:type="dxa" w:w="2736"/>
+            <w:tcBorders>
+              <w:top w:val="single" w:sz="4" w:color="C8CDC2"/>
+              <w:left w:val="single" w:sz="4" w:color="C8CDC2"/>
+              <w:bottom w:val="single" w:sz="4" w:color="C8CDC2"/>
+              <w:right w:val="single" w:sz="4" w:color="C8CDC2"/>
+            </w:tcBorders>
+            <w:vAlign w:val="center"/>
+            <w:tcMar>
+              <w:top w:w="10" w:type="dxa"/>
+              <w:left w:w="60" w:type="dxa"/>
+              <w:bottom w:w="10" w:type="dxa"/>
+              <w:right w:w="40" w:type="dxa"/>
+            </w:tcMar>
+          </w:tcPr>
+          <w:p>
+            <w:pPr>
+              <w:keepNext/>
+              <w:spacing w:after="0"/>
+            </w:pPr>
+            <w:r>
+              <w:rPr>
+                <w:rFonts w:ascii="Trade Gothic Next" w:hAnsi="Trade Gothic Next"/>
+                <w:b/>
+                <w:color w:val="14161B"/>
+                <w:sz w:val="20"/>
+                <w:u w:val="none"/>
+              </w:rPr>
+              <w:t>Oxygen, O</w:t>
+            </w:r>
+          </w:p>
+        </w:tc>
+        <w:tc>
+          <w:tcPr>
+            <w:tcW w:type="dxa" w:w="2880"/>
+            <w:tcBorders>
+              <w:top w:val="single" w:sz="4" w:color="C8CDC2"/>
+              <w:left w:val="single" w:sz="4" w:color="C8CDC2"/>
+              <w:bottom w:val="single" w:sz="4" w:color="C8CDC2"/>
+              <w:right w:val="single" w:sz="4" w:color="C8CDC2"/>
+            </w:tcBorders>
+            <w:vAlign w:val="center"/>
+            <w:tcMar>
+              <w:top w:w="10" w:type="dxa"/>
+              <w:left w:w="60" w:type="dxa"/>
+              <w:bottom w:w="10" w:type="dxa"/>
+              <w:right w:w="40" w:type="dxa"/>
+            </w:tcMar>
+          </w:tcPr>
+          <w:p>
+            <w:pPr>
+              <w:keepNext/>
+              <w:spacing w:after="0"/>
+            </w:pPr>
+          </w:p>
+        </w:tc>
+        <w:tc>
+          <w:tcPr>
+            <w:tcW w:type="dxa" w:w="2304"/>
+            <w:tcBorders>
+              <w:top w:val="single" w:sz="4" w:color="C8CDC2"/>
+              <w:left w:val="single" w:sz="4" w:color="C8CDC2"/>
+              <w:bottom w:val="single" w:sz="4" w:color="C8CDC2"/>
+              <w:right w:val="single" w:sz="4" w:color="C8CDC2"/>
+            </w:tcBorders>
+            <w:vAlign w:val="center"/>
+            <w:tcMar>
+              <w:top w:w="10" w:type="dxa"/>
+              <w:left w:w="60" w:type="dxa"/>
+              <w:bottom w:w="10" w:type="dxa"/>
+              <w:right w:w="40" w:type="dxa"/>
+            </w:tcMar>
+          </w:tcPr>
+          <w:p>
+            <w:pPr>
+              <w:keepNext/>
+              <w:spacing w:after="0"/>
+            </w:pPr>
+          </w:p>
+        </w:tc>
+        <w:tc>
+          <w:tcPr>
+            <w:tcW w:type="dxa" w:w="2880"/>
+            <w:tcBorders>
+              <w:top w:val="single" w:sz="4" w:color="C8CDC2"/>
+              <w:left w:val="single" w:sz="4" w:color="C8CDC2"/>
+              <w:bottom w:val="single" w:sz="4" w:color="C8CDC2"/>
+              <w:right w:val="single" w:sz="4" w:color="C8CDC2"/>
+            </w:tcBorders>
+            <w:vAlign w:val="center"/>
+            <w:tcMar>
+              <w:top w:w="10" w:type="dxa"/>
+              <w:left w:w="60" w:type="dxa"/>
+              <w:bottom w:w="10" w:type="dxa"/>
+              <w:right w:w="40" w:type="dxa"/>
+            </w:tcMar>
+          </w:tcPr>
+          <w:p>
+            <w:pPr>
+              <w:keepNext/>
+              <w:spacing w:after="0"/>
+            </w:pPr>
+          </w:p>
+        </w:tc>
+      </w:tr>
+      <w:tr>
+        <w:trPr>
+          <w:cantSplit/>
+          <w:trHeight w:val="460" w:hRule="atLeast"/>
+        </w:trPr>
+        <w:tc>
+          <w:tcPr>
+            <w:tcW w:type="dxa" w:w="2736"/>
             <w:tcBorders>
               <w:top w:val="single" w:sz="4" w:color="C8CDC2"/>
               <w:left w:val="single" w:sz="4" w:color="C8CDC2"/>
@@ -1465,7 +3370,7 @@
         </w:tc>
         <w:tc>
           <w:tcPr>
-            <w:tcW w:type="dxa" w:w="3600"/>
+            <w:tcW w:type="dxa" w:w="2880"/>
             <w:tcBorders>
               <w:top w:val="single" w:sz="4" w:color="C8CDC2"/>
               <w:left w:val="single" w:sz="4" w:color="C8CDC2"/>
@@ -1489,7 +3394,31 @@
         </w:tc>
         <w:tc>
           <w:tcPr>
-            <w:tcW w:type="dxa" w:w="3600"/>
+            <w:tcW w:type="dxa" w:w="2304"/>
+            <w:tcBorders>
+              <w:top w:val="single" w:sz="4" w:color="C8CDC2"/>
+              <w:left w:val="single" w:sz="4" w:color="C8CDC2"/>
+              <w:bottom w:val="single" w:sz="4" w:color="C8CDC2"/>
+              <w:right w:val="single" w:sz="4" w:color="C8CDC2"/>
+            </w:tcBorders>
+            <w:vAlign w:val="center"/>
+            <w:tcMar>
+              <w:top w:w="10" w:type="dxa"/>
+              <w:left w:w="60" w:type="dxa"/>
+              <w:bottom w:w="10" w:type="dxa"/>
+              <w:right w:w="40" w:type="dxa"/>
+            </w:tcMar>
+          </w:tcPr>
+          <w:p>
+            <w:pPr>
+              <w:keepNext/>
+              <w:spacing w:after="0"/>
+            </w:pPr>
+          </w:p>
+        </w:tc>
+        <w:tc>
+          <w:tcPr>
+            <w:tcW w:type="dxa" w:w="2880"/>
             <w:tcBorders>
               <w:top w:val="single" w:sz="4" w:color="C8CDC2"/>
               <w:left w:val="single" w:sz="4" w:color="C8CDC2"/>
@@ -1519,183 +3448,7 @@
         </w:trPr>
         <w:tc>
           <w:tcPr>
-            <w:tcW w:type="dxa" w:w="3600"/>
-            <w:tcBorders>
-              <w:top w:val="single" w:sz="4" w:color="C8CDC2"/>
-              <w:left w:val="single" w:sz="4" w:color="C8CDC2"/>
-              <w:bottom w:val="single" w:sz="4" w:color="C8CDC2"/>
-              <w:right w:val="single" w:sz="4" w:color="C8CDC2"/>
-            </w:tcBorders>
-            <w:vAlign w:val="center"/>
-            <w:tcMar>
-              <w:top w:w="10" w:type="dxa"/>
-              <w:left w:w="60" w:type="dxa"/>
-              <w:bottom w:w="10" w:type="dxa"/>
-              <w:right w:w="40" w:type="dxa"/>
-            </w:tcMar>
-          </w:tcPr>
-          <w:p>
-            <w:pPr>
-              <w:keepNext/>
-              <w:spacing w:after="0"/>
-            </w:pPr>
-            <w:r>
-              <w:rPr>
-                <w:rFonts w:ascii="Trade Gothic Next" w:hAnsi="Trade Gothic Next"/>
-                <w:b/>
-                <w:color w:val="14161B"/>
-                <w:sz w:val="20"/>
-                <w:u w:val="none"/>
-              </w:rPr>
-              <w:t>Oxygen, O</w:t>
-            </w:r>
-          </w:p>
-        </w:tc>
-        <w:tc>
-          <w:tcPr>
-            <w:tcW w:type="dxa" w:w="3600"/>
-            <w:tcBorders>
-              <w:top w:val="single" w:sz="4" w:color="C8CDC2"/>
-              <w:left w:val="single" w:sz="4" w:color="C8CDC2"/>
-              <w:bottom w:val="single" w:sz="4" w:color="C8CDC2"/>
-              <w:right w:val="single" w:sz="4" w:color="C8CDC2"/>
-            </w:tcBorders>
-            <w:vAlign w:val="center"/>
-            <w:tcMar>
-              <w:top w:w="10" w:type="dxa"/>
-              <w:left w:w="60" w:type="dxa"/>
-              <w:bottom w:w="10" w:type="dxa"/>
-              <w:right w:w="40" w:type="dxa"/>
-            </w:tcMar>
-          </w:tcPr>
-          <w:p>
-            <w:pPr>
-              <w:keepNext/>
-              <w:spacing w:after="0"/>
-            </w:pPr>
-          </w:p>
-        </w:tc>
-        <w:tc>
-          <w:tcPr>
-            <w:tcW w:type="dxa" w:w="3600"/>
-            <w:tcBorders>
-              <w:top w:val="single" w:sz="4" w:color="C8CDC2"/>
-              <w:left w:val="single" w:sz="4" w:color="C8CDC2"/>
-              <w:bottom w:val="single" w:sz="4" w:color="C8CDC2"/>
-              <w:right w:val="single" w:sz="4" w:color="C8CDC2"/>
-            </w:tcBorders>
-            <w:vAlign w:val="center"/>
-            <w:tcMar>
-              <w:top w:w="10" w:type="dxa"/>
-              <w:left w:w="60" w:type="dxa"/>
-              <w:bottom w:w="10" w:type="dxa"/>
-              <w:right w:w="40" w:type="dxa"/>
-            </w:tcMar>
-          </w:tcPr>
-          <w:p>
-            <w:pPr>
-              <w:keepNext/>
-              <w:spacing w:after="0"/>
-            </w:pPr>
-          </w:p>
-        </w:tc>
-      </w:tr>
-      <w:tr>
-        <w:trPr>
-          <w:cantSplit/>
-          <w:trHeight w:val="460" w:hRule="atLeast"/>
-        </w:trPr>
-        <w:tc>
-          <w:tcPr>
-            <w:tcW w:type="dxa" w:w="3600"/>
-            <w:tcBorders>
-              <w:top w:val="single" w:sz="4" w:color="C8CDC2"/>
-              <w:left w:val="single" w:sz="4" w:color="C8CDC2"/>
-              <w:bottom w:val="single" w:sz="4" w:color="C8CDC2"/>
-              <w:right w:val="single" w:sz="4" w:color="C8CDC2"/>
-            </w:tcBorders>
-            <w:vAlign w:val="center"/>
-            <w:tcMar>
-              <w:top w:w="10" w:type="dxa"/>
-              <w:left w:w="60" w:type="dxa"/>
-              <w:bottom w:w="10" w:type="dxa"/>
-              <w:right w:w="40" w:type="dxa"/>
-            </w:tcMar>
-          </w:tcPr>
-          <w:p>
-            <w:pPr>
-              <w:keepNext/>
-              <w:spacing w:after="0"/>
-            </w:pPr>
-            <w:r>
-              <w:rPr>
-                <w:rFonts w:ascii="Trade Gothic Next" w:hAnsi="Trade Gothic Next"/>
-                <w:b/>
-                <w:color w:val="14161B"/>
-                <w:sz w:val="20"/>
-                <w:u w:val="none"/>
-              </w:rPr>
-              <w:t>Rubidium, Rb</w:t>
-            </w:r>
-          </w:p>
-        </w:tc>
-        <w:tc>
-          <w:tcPr>
-            <w:tcW w:type="dxa" w:w="3600"/>
-            <w:tcBorders>
-              <w:top w:val="single" w:sz="4" w:color="C8CDC2"/>
-              <w:left w:val="single" w:sz="4" w:color="C8CDC2"/>
-              <w:bottom w:val="single" w:sz="4" w:color="C8CDC2"/>
-              <w:right w:val="single" w:sz="4" w:color="C8CDC2"/>
-            </w:tcBorders>
-            <w:vAlign w:val="center"/>
-            <w:tcMar>
-              <w:top w:w="10" w:type="dxa"/>
-              <w:left w:w="60" w:type="dxa"/>
-              <w:bottom w:w="10" w:type="dxa"/>
-              <w:right w:w="40" w:type="dxa"/>
-            </w:tcMar>
-          </w:tcPr>
-          <w:p>
-            <w:pPr>
-              <w:keepNext/>
-              <w:spacing w:after="0"/>
-            </w:pPr>
-          </w:p>
-        </w:tc>
-        <w:tc>
-          <w:tcPr>
-            <w:tcW w:type="dxa" w:w="3600"/>
-            <w:tcBorders>
-              <w:top w:val="single" w:sz="4" w:color="C8CDC2"/>
-              <w:left w:val="single" w:sz="4" w:color="C8CDC2"/>
-              <w:bottom w:val="single" w:sz="4" w:color="C8CDC2"/>
-              <w:right w:val="single" w:sz="4" w:color="C8CDC2"/>
-            </w:tcBorders>
-            <w:vAlign w:val="center"/>
-            <w:tcMar>
-              <w:top w:w="10" w:type="dxa"/>
-              <w:left w:w="60" w:type="dxa"/>
-              <w:bottom w:w="10" w:type="dxa"/>
-              <w:right w:w="40" w:type="dxa"/>
-            </w:tcMar>
-          </w:tcPr>
-          <w:p>
-            <w:pPr>
-              <w:keepNext/>
-              <w:spacing w:after="0"/>
-            </w:pPr>
-          </w:p>
-        </w:tc>
-      </w:tr>
-      <w:tr>
-        <w:trPr>
-          <w:cantSplit/>
-          <w:trHeight w:val="460" w:hRule="atLeast"/>
-        </w:trPr>
-        <w:tc>
-          <w:tcPr>
-            <w:tcW w:type="dxa" w:w="3600"/>
+            <w:tcW w:type="dxa" w:w="2736"/>
             <w:tcBorders>
               <w:top w:val="single" w:sz="4" w:color="C8CDC2"/>
               <w:left w:val="single" w:sz="4" w:color="C8CDC2"/>
@@ -1728,7 +3481,7 @@
         </w:tc>
         <w:tc>
           <w:tcPr>
-            <w:tcW w:type="dxa" w:w="3600"/>
+            <w:tcW w:type="dxa" w:w="2880"/>
             <w:tcBorders>
               <w:top w:val="single" w:sz="4" w:color="C8CDC2"/>
               <w:left w:val="single" w:sz="4" w:color="C8CDC2"/>
@@ -1751,7 +3504,30 @@
         </w:tc>
         <w:tc>
           <w:tcPr>
-            <w:tcW w:type="dxa" w:w="3600"/>
+            <w:tcW w:type="dxa" w:w="2304"/>
+            <w:tcBorders>
+              <w:top w:val="single" w:sz="4" w:color="C8CDC2"/>
+              <w:left w:val="single" w:sz="4" w:color="C8CDC2"/>
+              <w:bottom w:val="single" w:sz="4" w:color="C8CDC2"/>
+              <w:right w:val="single" w:sz="4" w:color="C8CDC2"/>
+            </w:tcBorders>
+            <w:vAlign w:val="center"/>
+            <w:tcMar>
+              <w:top w:w="10" w:type="dxa"/>
+              <w:left w:w="60" w:type="dxa"/>
+              <w:bottom w:w="10" w:type="dxa"/>
+              <w:right w:w="40" w:type="dxa"/>
+            </w:tcMar>
+          </w:tcPr>
+          <w:p>
+            <w:pPr>
+              <w:spacing w:after="0"/>
+            </w:pPr>
+          </w:p>
+        </w:tc>
+        <w:tc>
+          <w:tcPr>
+            <w:tcW w:type="dxa" w:w="2880"/>
             <w:tcBorders>
               <w:top w:val="single" w:sz="4" w:color="C8CDC2"/>
               <w:left w:val="single" w:sz="4" w:color="C8CDC2"/>
@@ -1812,102 +3588,6 @@
                 <w:sz w:val="20"/>
                 <w:u w:val="none"/>
               </w:rPr>
-              <w:t xml:space="preserve">11   </w:t>
-            </w:r>
-            <w:r>
-              <w:rPr>
-                <w:rFonts w:ascii="Trade Gothic Next" w:hAnsi="Trade Gothic Next"/>
-                <w:b w:val="0"/>
-                <w:color w:val="14161B"/>
-                <w:sz w:val="20"/>
-                <w:u w:val="none"/>
-              </w:rPr>
-              <w:t>Name two ions that have the same electron arrangement as neon.</w:t>
-            </w:r>
-          </w:p>
-          <w:tbl>
-            <w:tblPr>
-              <w:tblW w:type="auto" w:w="0"/>
-              <w:tblLayout w:type="fixed"/>
-              <w:tblLook w:firstColumn="1" w:firstRow="1" w:lastColumn="0" w:lastRow="0" w:noHBand="0" w:noVBand="1" w:val="04A0"/>
-              <w:tblLayout w:type="fixed"/>
-            </w:tblPr>
-            <w:tblGrid>
-              <w:gridCol w:w="10152"/>
-            </w:tblGrid>
-            <w:tr>
-              <w:trPr>
-                <w:cantSplit/>
-                <w:trHeight w:val="460" w:hRule="atLeast"/>
-              </w:trPr>
-              <w:tc>
-                <w:tcPr>
-                  <w:tcW w:type="dxa" w:w="10152"/>
-                  <w:vAlign w:val="bottom"/>
-                  <w:tcBorders>
-                    <w:bottom w:val="single" w:sz="6" w:color="C8CDC2"/>
-                  </w:tcBorders>
-                  <w:tcMar>
-                    <w:top w:w="0" w:type="dxa"/>
-                    <w:left w:w="60" w:type="dxa"/>
-                    <w:bottom w:w="10" w:type="dxa"/>
-                    <w:right w:w="0" w:type="dxa"/>
-                  </w:tcMar>
-                </w:tcPr>
-                <w:p>
-                  <w:pPr>
-                    <w:spacing w:after="0"/>
-                  </w:pPr>
-                </w:p>
-              </w:tc>
-            </w:tr>
-          </w:tbl>
-          <w:p>
-            <w:pPr>
-              <w:spacing w:before="0" w:after="0" w:line="20" w:lineRule="exact"/>
-            </w:pPr>
-          </w:p>
-        </w:tc>
-      </w:tr>
-    </w:tbl>
-    <w:tbl>
-      <w:tblPr>
-        <w:tblW w:type="auto" w:w="0"/>
-        <w:jc w:val="left"/>
-        <w:tblLayout w:type="fixed"/>
-        <w:tblLook w:firstColumn="1" w:firstRow="1" w:lastColumn="0" w:lastRow="0" w:noHBand="0" w:noVBand="1" w:val="04A0"/>
-        <w:tblLayout w:type="fixed"/>
-      </w:tblPr>
-      <w:tblGrid>
-        <w:gridCol w:w="10800"/>
-      </w:tblGrid>
-      <w:tr>
-        <w:tc>
-          <w:tcPr>
-            <w:tcW w:type="dxa" w:w="10800"/>
-            <w:tcBorders>
-              <w:bottom w:val="single" w:sz="4" w:color="C8CDC2"/>
-            </w:tcBorders>
-            <w:tcMar>
-              <w:top w:w="30" w:type="dxa"/>
-              <w:left w:w="40" w:type="dxa"/>
-              <w:bottom w:w="30" w:type="dxa"/>
-              <w:right w:w="40" w:type="dxa"/>
-            </w:tcMar>
-          </w:tcPr>
-          <w:p>
-            <w:pPr>
-              <w:spacing w:after="20"/>
-              <w:ind w:left="360" w:hanging="360"/>
-            </w:pPr>
-            <w:r>
-              <w:rPr>
-                <w:rFonts w:ascii="Trade Gothic Next" w:hAnsi="Trade Gothic Next"/>
-                <w:b/>
-                <w:color w:val="4D730E"/>
-                <w:sz w:val="20"/>
-                <w:u w:val="none"/>
-              </w:rPr>
               <w:t xml:space="preserve">12   </w:t>
             </w:r>
             <w:r>
@@ -1918,28 +3598,7 @@
                 <w:sz w:val="20"/>
                 <w:u w:val="none"/>
               </w:rPr>
-              <w:t>Write the configuration of Zn</w:t>
-            </w:r>
-            <w:r>
-              <w:rPr>
-                <w:rFonts w:ascii="Trade Gothic Next" w:hAnsi="Trade Gothic Next"/>
-                <w:b w:val="0"/>
-                <w:color w:val="14161B"/>
-                <w:sz w:val="20"/>
-                <w:u w:val="none"/>
-                <w:vertAlign w:val="superscript"/>
-              </w:rPr>
-              <w:t>2+</w:t>
-            </w:r>
-            <w:r>
-              <w:rPr>
-                <w:rFonts w:ascii="Trade Gothic Next" w:hAnsi="Trade Gothic Next"/>
-                <w:b w:val="0"/>
-                <w:color w:val="14161B"/>
-                <w:sz w:val="20"/>
-                <w:u w:val="none"/>
-              </w:rPr>
-              <w:t>. Which electrons left first?</w:t>
+              <w:t>An ion has 18 electrons and a 2− charge. Which element is it, and did it gain or lose electrons?</w:t>
             </w:r>
           </w:p>
           <w:tbl>
@@ -2031,8 +3690,221 @@
                 <w:sz w:val="17"/>
                 <w:spacing w:val="26"/>
               </w:rPr>
-              <w:t>S2.5  ·  ATOMIC &amp; ELECTRON SPECTRA</w:t>
+              <w:t>6  ·  GROUND STATE, EXCITED STATE &amp; FLAME TESTS</w:t>
             </w:r>
+          </w:p>
+        </w:tc>
+      </w:tr>
+    </w:tbl>
+    <w:p>
+      <w:pPr>
+        <w:spacing w:before="0" w:after="0" w:line="40" w:lineRule="exact"/>
+      </w:pPr>
+      <w:r>
+        <w:rPr>
+          <w:rFonts w:ascii="Trade Gothic Next" w:hAnsi="Trade Gothic Next"/>
+          <w:sz w:val="2"/>
+        </w:rPr>
+      </w:r>
+    </w:p>
+    <w:tbl>
+      <w:tblPr>
+        <w:tblW w:type="auto" w:w="0"/>
+        <w:tblLayout w:type="fixed"/>
+        <w:tblLook w:firstColumn="1" w:firstRow="1" w:lastColumn="0" w:lastRow="0" w:noHBand="0" w:noVBand="1" w:val="04A0"/>
+        <w:tblLayout w:type="fixed"/>
+      </w:tblPr>
+      <w:tblGrid>
+        <w:gridCol w:w="2736"/>
+        <w:gridCol w:w="8064"/>
+      </w:tblGrid>
+      <w:tr>
+        <w:tc>
+          <w:tcPr>
+            <w:tcW w:type="dxa" w:w="2736"/>
+            <w:tcBorders>
+              <w:bottom w:val="single" w:sz="12" w:color="A3E635"/>
+            </w:tcBorders>
+            <w:vAlign w:val="center"/>
+            <w:tcMar>
+              <w:top w:w="20" w:type="dxa"/>
+              <w:left w:w="60" w:type="dxa"/>
+              <w:bottom w:w="20" w:type="dxa"/>
+              <w:right w:w="40" w:type="dxa"/>
+            </w:tcMar>
+          </w:tcPr>
+          <w:p>
+            <w:pPr>
+              <w:keepNext/>
+              <w:spacing w:after="0"/>
+            </w:pPr>
+            <w:r>
+              <w:rPr>
+                <w:rFonts w:ascii="Trade Gothic Next" w:hAnsi="Trade Gothic Next"/>
+                <w:b/>
+                <w:color w:val="4D730E"/>
+                <w:sz w:val="16"/>
+                <w:u w:val="none"/>
+              </w:rPr>
+              <w:t>STATE</w:t>
+            </w:r>
+          </w:p>
+        </w:tc>
+        <w:tc>
+          <w:tcPr>
+            <w:tcW w:type="dxa" w:w="8064"/>
+            <w:tcBorders>
+              <w:bottom w:val="single" w:sz="12" w:color="A3E635"/>
+            </w:tcBorders>
+            <w:vAlign w:val="center"/>
+            <w:tcMar>
+              <w:top w:w="20" w:type="dxa"/>
+              <w:left w:w="60" w:type="dxa"/>
+              <w:bottom w:w="20" w:type="dxa"/>
+              <w:right w:w="40" w:type="dxa"/>
+            </w:tcMar>
+          </w:tcPr>
+          <w:p>
+            <w:pPr>
+              <w:keepNext/>
+              <w:spacing w:after="0"/>
+            </w:pPr>
+            <w:r>
+              <w:rPr>
+                <w:rFonts w:ascii="Trade Gothic Next" w:hAnsi="Trade Gothic Next"/>
+                <w:b/>
+                <w:color w:val="4D730E"/>
+                <w:sz w:val="16"/>
+                <w:u w:val="none"/>
+              </w:rPr>
+              <w:t>WHAT THE ELECTRON IS DOING</w:t>
+            </w:r>
+          </w:p>
+        </w:tc>
+      </w:tr>
+      <w:tr>
+        <w:trPr>
+          <w:cantSplit/>
+          <w:trHeight w:val="460" w:hRule="atLeast"/>
+        </w:trPr>
+        <w:tc>
+          <w:tcPr>
+            <w:tcW w:type="dxa" w:w="2736"/>
+            <w:tcBorders>
+              <w:top w:val="single" w:sz="4" w:color="C8CDC2"/>
+              <w:left w:val="single" w:sz="4" w:color="C8CDC2"/>
+              <w:bottom w:val="single" w:sz="4" w:color="C8CDC2"/>
+              <w:right w:val="single" w:sz="4" w:color="C8CDC2"/>
+            </w:tcBorders>
+            <w:vAlign w:val="center"/>
+            <w:tcMar>
+              <w:top w:w="10" w:type="dxa"/>
+              <w:left w:w="60" w:type="dxa"/>
+              <w:bottom w:w="10" w:type="dxa"/>
+              <w:right w:w="40" w:type="dxa"/>
+            </w:tcMar>
+          </w:tcPr>
+          <w:p>
+            <w:pPr>
+              <w:keepNext/>
+              <w:spacing w:after="0"/>
+            </w:pPr>
+            <w:r>
+              <w:rPr>
+                <w:rFonts w:ascii="Trade Gothic Next" w:hAnsi="Trade Gothic Next"/>
+                <w:b/>
+                <w:color w:val="14161B"/>
+                <w:sz w:val="20"/>
+                <w:u w:val="none"/>
+              </w:rPr>
+              <w:t>Ground state</w:t>
+            </w:r>
+          </w:p>
+        </w:tc>
+        <w:tc>
+          <w:tcPr>
+            <w:tcW w:type="dxa" w:w="8064"/>
+            <w:tcBorders>
+              <w:top w:val="single" w:sz="4" w:color="C8CDC2"/>
+              <w:left w:val="single" w:sz="4" w:color="C8CDC2"/>
+              <w:bottom w:val="single" w:sz="4" w:color="C8CDC2"/>
+              <w:right w:val="single" w:sz="4" w:color="C8CDC2"/>
+            </w:tcBorders>
+            <w:vAlign w:val="center"/>
+            <w:tcMar>
+              <w:top w:w="10" w:type="dxa"/>
+              <w:left w:w="60" w:type="dxa"/>
+              <w:bottom w:w="10" w:type="dxa"/>
+              <w:right w:w="40" w:type="dxa"/>
+            </w:tcMar>
+          </w:tcPr>
+          <w:p>
+            <w:pPr>
+              <w:keepNext/>
+              <w:spacing w:after="0"/>
+            </w:pPr>
+          </w:p>
+        </w:tc>
+      </w:tr>
+      <w:tr>
+        <w:trPr>
+          <w:cantSplit/>
+          <w:trHeight w:val="460" w:hRule="atLeast"/>
+        </w:trPr>
+        <w:tc>
+          <w:tcPr>
+            <w:tcW w:type="dxa" w:w="2736"/>
+            <w:tcBorders>
+              <w:top w:val="single" w:sz="4" w:color="C8CDC2"/>
+              <w:left w:val="single" w:sz="4" w:color="C8CDC2"/>
+              <w:bottom w:val="single" w:sz="4" w:color="C8CDC2"/>
+              <w:right w:val="single" w:sz="4" w:color="C8CDC2"/>
+            </w:tcBorders>
+            <w:vAlign w:val="center"/>
+            <w:tcMar>
+              <w:top w:w="10" w:type="dxa"/>
+              <w:left w:w="60" w:type="dxa"/>
+              <w:bottom w:w="10" w:type="dxa"/>
+              <w:right w:w="40" w:type="dxa"/>
+            </w:tcMar>
+          </w:tcPr>
+          <w:p>
+            <w:pPr>
+              <w:spacing w:after="0"/>
+            </w:pPr>
+            <w:r>
+              <w:rPr>
+                <w:rFonts w:ascii="Trade Gothic Next" w:hAnsi="Trade Gothic Next"/>
+                <w:b/>
+                <w:color w:val="14161B"/>
+                <w:sz w:val="20"/>
+                <w:u w:val="none"/>
+              </w:rPr>
+              <w:t>Excited state</w:t>
+            </w:r>
+          </w:p>
+        </w:tc>
+        <w:tc>
+          <w:tcPr>
+            <w:tcW w:type="dxa" w:w="8064"/>
+            <w:tcBorders>
+              <w:top w:val="single" w:sz="4" w:color="C8CDC2"/>
+              <w:left w:val="single" w:sz="4" w:color="C8CDC2"/>
+              <w:bottom w:val="single" w:sz="4" w:color="C8CDC2"/>
+              <w:right w:val="single" w:sz="4" w:color="C8CDC2"/>
+            </w:tcBorders>
+            <w:vAlign w:val="center"/>
+            <w:tcMar>
+              <w:top w:w="10" w:type="dxa"/>
+              <w:left w:w="60" w:type="dxa"/>
+              <w:bottom w:w="10" w:type="dxa"/>
+              <w:right w:w="40" w:type="dxa"/>
+            </w:tcMar>
+          </w:tcPr>
+          <w:p>
+            <w:pPr>
+              <w:spacing w:after="0"/>
+            </w:pPr>
           </w:p>
         </w:tc>
       </w:tr>
@@ -2085,7 +3957,7 @@
                 <w:sz w:val="20"/>
                 <w:u w:val="none"/>
               </w:rPr>
-              <w:t>An electron moves from n = 2 to n = 5. Does the atom absorb or emit a photon?</w:t>
+              <w:t>An electron drops from n = 4 to n = 2. Is light absorbed or emitted? Explain.</w:t>
             </w:r>
           </w:p>
           <w:tbl>
@@ -2181,9 +4053,47 @@
                 <w:sz w:val="20"/>
                 <w:u w:val="none"/>
               </w:rPr>
-              <w:t>Which photon has more energy, 486 nm or 656 nm?</w:t>
+              <w:t>What decides the color of the light an atom gives off?</w:t>
             </w:r>
           </w:p>
+          <w:tbl>
+            <w:tblPr>
+              <w:tblW w:type="auto" w:w="0"/>
+              <w:tblLayout w:type="fixed"/>
+              <w:tblLook w:firstColumn="1" w:firstRow="1" w:lastColumn="0" w:lastRow="0" w:noHBand="0" w:noVBand="1" w:val="04A0"/>
+              <w:tblLayout w:type="fixed"/>
+            </w:tblPr>
+            <w:tblGrid>
+              <w:gridCol w:w="10152"/>
+            </w:tblGrid>
+            <w:tr>
+              <w:trPr>
+                <w:cantSplit/>
+                <w:trHeight w:val="460" w:hRule="atLeast"/>
+              </w:trPr>
+              <w:tc>
+                <w:tcPr>
+                  <w:tcW w:type="dxa" w:w="10152"/>
+                  <w:vAlign w:val="bottom"/>
+                  <w:tcBorders>
+                    <w:bottom w:val="single" w:sz="6" w:color="C8CDC2"/>
+                  </w:tcBorders>
+                  <w:tcMar>
+                    <w:top w:w="0" w:type="dxa"/>
+                    <w:left w:w="60" w:type="dxa"/>
+                    <w:bottom w:w="10" w:type="dxa"/>
+                    <w:right w:w="0" w:type="dxa"/>
+                  </w:tcMar>
+                </w:tcPr>
+                <w:p>
+                  <w:pPr>
+                    <w:spacing w:after="0"/>
+                  </w:pPr>
+                </w:p>
+              </w:tc>
+            </w:tr>
+          </w:tbl>
+          <w:p/>
           <w:tbl>
             <w:tblPr>
               <w:tblW w:type="auto" w:w="0"/>
@@ -2229,6 +4139,371 @@
         </w:tc>
       </w:tr>
     </w:tbl>
+    <w:p>
+      <w:pPr>
+        <w:spacing w:before="0" w:after="0" w:line="60" w:lineRule="exact"/>
+      </w:pPr>
+      <w:r>
+        <w:rPr>
+          <w:rFonts w:ascii="Trade Gothic Next" w:hAnsi="Trade Gothic Next"/>
+          <w:sz w:val="2"/>
+        </w:rPr>
+      </w:r>
+    </w:p>
+    <w:tbl>
+      <w:tblPr>
+        <w:tblW w:type="auto" w:w="0"/>
+        <w:jc w:val="left"/>
+        <w:tblLayout w:type="fixed"/>
+        <w:tblLook w:firstColumn="1" w:firstRow="1" w:lastColumn="0" w:lastRow="0" w:noHBand="0" w:noVBand="1" w:val="04A0"/>
+        <w:tblLayout w:type="fixed"/>
+      </w:tblPr>
+      <w:tblGrid>
+        <w:gridCol w:w="10800"/>
+      </w:tblGrid>
+      <w:tr>
+        <w:tc>
+          <w:tcPr>
+            <w:tcW w:type="dxa" w:w="10800"/>
+            <w:tcMar>
+              <w:top w:w="0" w:type="dxa"/>
+              <w:left w:w="40" w:type="dxa"/>
+              <w:bottom w:w="20" w:type="dxa"/>
+              <w:right w:w="40" w:type="dxa"/>
+            </w:tcMar>
+          </w:tcPr>
+          <w:p>
+            <w:pPr>
+              <w:spacing w:after="0"/>
+              <w:ind w:left="360" w:hanging="360"/>
+            </w:pPr>
+            <w:r>
+              <w:rPr>
+                <w:rFonts w:ascii="Trade Gothic Next" w:hAnsi="Trade Gothic Next"/>
+                <w:b/>
+                <w:color w:val="4D730E"/>
+                <w:sz w:val="20"/>
+                <w:u w:val="none"/>
+              </w:rPr>
+              <w:t xml:space="preserve">15   </w:t>
+            </w:r>
+            <w:r>
+              <w:rPr>
+                <w:rFonts w:ascii="Trade Gothic Next" w:hAnsi="Trade Gothic Next"/>
+                <w:b w:val="0"/>
+                <w:color w:val="14161B"/>
+                <w:sz w:val="20"/>
+                <w:u w:val="none"/>
+              </w:rPr>
+              <w:t>In a flame test, which ion gives each color?</w:t>
+            </w:r>
+          </w:p>
+        </w:tc>
+      </w:tr>
+    </w:tbl>
+    <w:tbl>
+      <w:tblPr>
+        <w:tblW w:type="auto" w:w="0"/>
+        <w:tblLayout w:type="fixed"/>
+        <w:tblLook w:firstColumn="1" w:firstRow="1" w:lastColumn="0" w:lastRow="0" w:noHBand="0" w:noVBand="1" w:val="04A0"/>
+        <w:tblLayout w:type="fixed"/>
+      </w:tblPr>
+      <w:tblGrid>
+        <w:gridCol w:w="2160"/>
+        <w:gridCol w:w="2160"/>
+        <w:gridCol w:w="2160"/>
+        <w:gridCol w:w="2160"/>
+        <w:gridCol w:w="2160"/>
+      </w:tblGrid>
+      <w:tr>
+        <w:tc>
+          <w:tcPr>
+            <w:tcW w:type="dxa" w:w="2160"/>
+            <w:tcBorders>
+              <w:bottom w:val="single" w:sz="12" w:color="A3E635"/>
+            </w:tcBorders>
+            <w:vAlign w:val="center"/>
+            <w:tcMar>
+              <w:top w:w="20" w:type="dxa"/>
+              <w:left w:w="60" w:type="dxa"/>
+              <w:bottom w:w="20" w:type="dxa"/>
+              <w:right w:w="40" w:type="dxa"/>
+            </w:tcMar>
+          </w:tcPr>
+          <w:p>
+            <w:pPr>
+              <w:keepNext/>
+              <w:spacing w:after="0"/>
+            </w:pPr>
+            <w:r>
+              <w:rPr>
+                <w:rFonts w:ascii="Trade Gothic Next" w:hAnsi="Trade Gothic Next"/>
+                <w:b/>
+                <w:color w:val="4D730E"/>
+                <w:sz w:val="16"/>
+                <w:u w:val="none"/>
+              </w:rPr>
+              <w:t>FLAME COLOR</w:t>
+            </w:r>
+          </w:p>
+        </w:tc>
+        <w:tc>
+          <w:tcPr>
+            <w:tcW w:type="dxa" w:w="2160"/>
+            <w:tcBorders>
+              <w:bottom w:val="single" w:sz="12" w:color="A3E635"/>
+            </w:tcBorders>
+            <w:vAlign w:val="center"/>
+            <w:tcMar>
+              <w:top w:w="20" w:type="dxa"/>
+              <w:left w:w="60" w:type="dxa"/>
+              <w:bottom w:w="20" w:type="dxa"/>
+              <w:right w:w="40" w:type="dxa"/>
+            </w:tcMar>
+          </w:tcPr>
+          <w:p>
+            <w:pPr>
+              <w:keepNext/>
+              <w:spacing w:after="0"/>
+            </w:pPr>
+            <w:r>
+              <w:rPr>
+                <w:rFonts w:ascii="Trade Gothic Next" w:hAnsi="Trade Gothic Next"/>
+                <w:b/>
+                <w:color w:val="4D730E"/>
+                <w:sz w:val="16"/>
+                <w:u w:val="none"/>
+              </w:rPr>
+              <w:t>Yellow</w:t>
+            </w:r>
+          </w:p>
+        </w:tc>
+        <w:tc>
+          <w:tcPr>
+            <w:tcW w:type="dxa" w:w="2160"/>
+            <w:tcBorders>
+              <w:bottom w:val="single" w:sz="12" w:color="A3E635"/>
+            </w:tcBorders>
+            <w:vAlign w:val="center"/>
+            <w:tcMar>
+              <w:top w:w="20" w:type="dxa"/>
+              <w:left w:w="60" w:type="dxa"/>
+              <w:bottom w:w="20" w:type="dxa"/>
+              <w:right w:w="40" w:type="dxa"/>
+            </w:tcMar>
+          </w:tcPr>
+          <w:p>
+            <w:pPr>
+              <w:keepNext/>
+              <w:spacing w:after="0"/>
+            </w:pPr>
+            <w:r>
+              <w:rPr>
+                <w:rFonts w:ascii="Trade Gothic Next" w:hAnsi="Trade Gothic Next"/>
+                <w:b/>
+                <w:color w:val="4D730E"/>
+                <w:sz w:val="16"/>
+                <w:u w:val="none"/>
+              </w:rPr>
+              <w:t>Crimson red</w:t>
+            </w:r>
+          </w:p>
+        </w:tc>
+        <w:tc>
+          <w:tcPr>
+            <w:tcW w:type="dxa" w:w="2160"/>
+            <w:tcBorders>
+              <w:bottom w:val="single" w:sz="12" w:color="A3E635"/>
+            </w:tcBorders>
+            <w:vAlign w:val="center"/>
+            <w:tcMar>
+              <w:top w:w="20" w:type="dxa"/>
+              <w:left w:w="60" w:type="dxa"/>
+              <w:bottom w:w="20" w:type="dxa"/>
+              <w:right w:w="40" w:type="dxa"/>
+            </w:tcMar>
+          </w:tcPr>
+          <w:p>
+            <w:pPr>
+              <w:keepNext/>
+              <w:spacing w:after="0"/>
+            </w:pPr>
+            <w:r>
+              <w:rPr>
+                <w:rFonts w:ascii="Trade Gothic Next" w:hAnsi="Trade Gothic Next"/>
+                <w:b/>
+                <w:color w:val="4D730E"/>
+                <w:sz w:val="16"/>
+                <w:u w:val="none"/>
+              </w:rPr>
+              <w:t>Blue-green</w:t>
+            </w:r>
+          </w:p>
+        </w:tc>
+        <w:tc>
+          <w:tcPr>
+            <w:tcW w:type="dxa" w:w="2160"/>
+            <w:tcBorders>
+              <w:bottom w:val="single" w:sz="12" w:color="A3E635"/>
+            </w:tcBorders>
+            <w:vAlign w:val="center"/>
+            <w:tcMar>
+              <w:top w:w="20" w:type="dxa"/>
+              <w:left w:w="60" w:type="dxa"/>
+              <w:bottom w:w="20" w:type="dxa"/>
+              <w:right w:w="40" w:type="dxa"/>
+            </w:tcMar>
+          </w:tcPr>
+          <w:p>
+            <w:pPr>
+              <w:keepNext/>
+              <w:spacing w:after="0"/>
+            </w:pPr>
+            <w:r>
+              <w:rPr>
+                <w:rFonts w:ascii="Trade Gothic Next" w:hAnsi="Trade Gothic Next"/>
+                <w:b/>
+                <w:color w:val="4D730E"/>
+                <w:sz w:val="16"/>
+                <w:u w:val="none"/>
+              </w:rPr>
+              <w:t>Lilac</w:t>
+            </w:r>
+          </w:p>
+        </w:tc>
+      </w:tr>
+      <w:tr>
+        <w:trPr>
+          <w:cantSplit/>
+          <w:trHeight w:val="489" w:hRule="atLeast"/>
+        </w:trPr>
+        <w:tc>
+          <w:tcPr>
+            <w:tcW w:type="dxa" w:w="2160"/>
+            <w:tcBorders>
+              <w:top w:val="single" w:sz="4" w:color="C8CDC2"/>
+              <w:left w:val="single" w:sz="4" w:color="C8CDC2"/>
+              <w:bottom w:val="single" w:sz="4" w:color="C8CDC2"/>
+              <w:right w:val="single" w:sz="4" w:color="C8CDC2"/>
+            </w:tcBorders>
+            <w:vAlign w:val="center"/>
+            <w:tcMar>
+              <w:top w:w="10" w:type="dxa"/>
+              <w:left w:w="60" w:type="dxa"/>
+              <w:bottom w:w="10" w:type="dxa"/>
+              <w:right w:w="40" w:type="dxa"/>
+            </w:tcMar>
+          </w:tcPr>
+          <w:p>
+            <w:pPr>
+              <w:spacing w:after="0"/>
+            </w:pPr>
+            <w:r>
+              <w:rPr>
+                <w:rFonts w:ascii="Trade Gothic Next" w:hAnsi="Trade Gothic Next"/>
+                <w:b/>
+                <w:color w:val="14161B"/>
+                <w:sz w:val="20"/>
+                <w:u w:val="none"/>
+              </w:rPr>
+              <w:t>Ion</w:t>
+            </w:r>
+          </w:p>
+        </w:tc>
+        <w:tc>
+          <w:tcPr>
+            <w:tcW w:type="dxa" w:w="2160"/>
+            <w:tcBorders>
+              <w:top w:val="single" w:sz="4" w:color="C8CDC2"/>
+              <w:left w:val="single" w:sz="4" w:color="C8CDC2"/>
+              <w:bottom w:val="single" w:sz="4" w:color="C8CDC2"/>
+              <w:right w:val="single" w:sz="4" w:color="C8CDC2"/>
+            </w:tcBorders>
+            <w:vAlign w:val="center"/>
+            <w:tcMar>
+              <w:top w:w="10" w:type="dxa"/>
+              <w:left w:w="60" w:type="dxa"/>
+              <w:bottom w:w="10" w:type="dxa"/>
+              <w:right w:w="40" w:type="dxa"/>
+            </w:tcMar>
+          </w:tcPr>
+          <w:p>
+            <w:pPr>
+              <w:spacing w:after="0"/>
+            </w:pPr>
+          </w:p>
+        </w:tc>
+        <w:tc>
+          <w:tcPr>
+            <w:tcW w:type="dxa" w:w="2160"/>
+            <w:tcBorders>
+              <w:top w:val="single" w:sz="4" w:color="C8CDC2"/>
+              <w:left w:val="single" w:sz="4" w:color="C8CDC2"/>
+              <w:bottom w:val="single" w:sz="4" w:color="C8CDC2"/>
+              <w:right w:val="single" w:sz="4" w:color="C8CDC2"/>
+            </w:tcBorders>
+            <w:vAlign w:val="center"/>
+            <w:tcMar>
+              <w:top w:w="10" w:type="dxa"/>
+              <w:left w:w="60" w:type="dxa"/>
+              <w:bottom w:w="10" w:type="dxa"/>
+              <w:right w:w="40" w:type="dxa"/>
+            </w:tcMar>
+          </w:tcPr>
+          <w:p>
+            <w:pPr>
+              <w:spacing w:after="0"/>
+            </w:pPr>
+          </w:p>
+        </w:tc>
+        <w:tc>
+          <w:tcPr>
+            <w:tcW w:type="dxa" w:w="2160"/>
+            <w:tcBorders>
+              <w:top w:val="single" w:sz="4" w:color="C8CDC2"/>
+              <w:left w:val="single" w:sz="4" w:color="C8CDC2"/>
+              <w:bottom w:val="single" w:sz="4" w:color="C8CDC2"/>
+              <w:right w:val="single" w:sz="4" w:color="C8CDC2"/>
+            </w:tcBorders>
+            <w:vAlign w:val="center"/>
+            <w:tcMar>
+              <w:top w:w="10" w:type="dxa"/>
+              <w:left w:w="60" w:type="dxa"/>
+              <w:bottom w:w="10" w:type="dxa"/>
+              <w:right w:w="40" w:type="dxa"/>
+            </w:tcMar>
+          </w:tcPr>
+          <w:p>
+            <w:pPr>
+              <w:spacing w:after="0"/>
+            </w:pPr>
+          </w:p>
+        </w:tc>
+        <w:tc>
+          <w:tcPr>
+            <w:tcW w:type="dxa" w:w="2160"/>
+            <w:tcBorders>
+              <w:top w:val="single" w:sz="4" w:color="C8CDC2"/>
+              <w:left w:val="single" w:sz="4" w:color="C8CDC2"/>
+              <w:bottom w:val="single" w:sz="4" w:color="C8CDC2"/>
+              <w:right w:val="single" w:sz="4" w:color="C8CDC2"/>
+            </w:tcBorders>
+            <w:vAlign w:val="center"/>
+            <w:tcMar>
+              <w:top w:w="10" w:type="dxa"/>
+              <w:left w:w="60" w:type="dxa"/>
+              <w:bottom w:w="10" w:type="dxa"/>
+              <w:right w:w="40" w:type="dxa"/>
+            </w:tcMar>
+          </w:tcPr>
+          <w:p>
+            <w:pPr>
+              <w:spacing w:after="0"/>
+            </w:pPr>
+          </w:p>
+        </w:tc>
+      </w:tr>
+    </w:tbl>
     <w:tbl>
       <w:tblPr>
         <w:tblW w:type="auto" w:w="0"/>
@@ -2267,7 +4542,7 @@
                 <w:sz w:val="20"/>
                 <w:u w:val="none"/>
               </w:rPr>
-              <w:t xml:space="preserve">15   </w:t>
+              <w:t xml:space="preserve">16   </w:t>
             </w:r>
             <w:r>
               <w:rPr>
@@ -2277,9 +4552,47 @@
                 <w:sz w:val="20"/>
                 <w:u w:val="none"/>
               </w:rPr>
-              <w:t>Why does every element give off its own pattern of lines?</w:t>
+              <w:t>Why does each element give its own flame color?</w:t>
             </w:r>
           </w:p>
+          <w:tbl>
+            <w:tblPr>
+              <w:tblW w:type="auto" w:w="0"/>
+              <w:tblLayout w:type="fixed"/>
+              <w:tblLook w:firstColumn="1" w:firstRow="1" w:lastColumn="0" w:lastRow="0" w:noHBand="0" w:noVBand="1" w:val="04A0"/>
+              <w:tblLayout w:type="fixed"/>
+            </w:tblPr>
+            <w:tblGrid>
+              <w:gridCol w:w="10152"/>
+            </w:tblGrid>
+            <w:tr>
+              <w:trPr>
+                <w:cantSplit/>
+                <w:trHeight w:val="460" w:hRule="atLeast"/>
+              </w:trPr>
+              <w:tc>
+                <w:tcPr>
+                  <w:tcW w:type="dxa" w:w="10152"/>
+                  <w:vAlign w:val="bottom"/>
+                  <w:tcBorders>
+                    <w:bottom w:val="single" w:sz="6" w:color="C8CDC2"/>
+                  </w:tcBorders>
+                  <w:tcMar>
+                    <w:top w:w="0" w:type="dxa"/>
+                    <w:left w:w="60" w:type="dxa"/>
+                    <w:bottom w:w="10" w:type="dxa"/>
+                    <w:right w:w="0" w:type="dxa"/>
+                  </w:tcMar>
+                </w:tcPr>
+                <w:p>
+                  <w:pPr>
+                    <w:spacing w:after="0"/>
+                  </w:pPr>
+                </w:p>
+              </w:tc>
+            </w:tr>
+          </w:tbl>
+          <w:p/>
           <w:tbl>
             <w:tblPr>
               <w:tblW w:type="auto" w:w="0"/>
@@ -2335,7 +4648,7 @@
       </w:pPr>
     </w:p>
     <w:sectPr>
-      <w:footerReference w:type="default" r:id="rId9"/>
+      <w:footerReference w:type="default" r:id="rId14"/>
       <w:pgSz w:w="12240" w:h="15840"/>
       <w:pgMar w:top="634" w:right="720" w:bottom="634" w:left="720" w:header="720" w:footer="720" w:gutter="0"/>
       <w:cols w:space="720"/>
@@ -2357,7 +4670,7 @@
         <w:color w:val="61675B"/>
         <w:sz w:val="14"/>
       </w:rPr>
-      <w:t>SHULL SCIENCE          U02 · S2.1-S2.5</w:t>
+      <w:t>SHULL SCIENCE          U02  ·  UNIT TEST STUDY GUIDE</w:t>
     </w:r>
     <w:r>
       <w:rPr>

</xml_diff>